<commit_message>
ajout doc pdf et diverses modifs
</commit_message>
<xml_diff>
--- a/jeux d'attributs.docx
+++ b/jeux d'attributs.docx
@@ -131,6 +131,16 @@
                 <w:szCs w:val="44"/>
               </w:rPr>
               <w:t>Jeux d’attributs</w:t>
+            </w:r>
+            <w:r>
+              <w:rPr>
+                <w:rFonts w:ascii="Times New Roman" w:hAnsi="Times New Roman" w:cs="Times New Roman"/>
+                <w:b/>
+                <w:noProof/>
+                <w:sz w:val="44"/>
+                <w:szCs w:val="44"/>
+              </w:rPr>
+              <w:t xml:space="preserve"> génériques</w:t>
             </w:r>
             <w:r>
               <w:rPr>
@@ -867,7 +877,7 @@
                 <w:docPart w:val="040C324AC53043D19398B4EE6A36694E"/>
               </w:placeholder>
               <w:dataBinding w:prefixMappings="xmlns:ns0='http://schemas.microsoft.com/office/2006/metadata/properties' xmlns:ns1='http://www.w3.org/2001/XMLSchema-instance' xmlns:ns2='http://schemas.microsoft.com/office/infopath/2007/PartnerControls' xmlns:ns3='a1322699-2fbb-4cce-8aba-176c4fa97253' xmlns:ns4='http://schemas.microsoft.com/sharepoint/v3' xmlns:ns5='http://schemas.microsoft.com/sharepoint/v3/fields' xmlns:ns6='f0ff482e-aa3b-417e-9d65-5f4cb2656651' " w:xpath="/ns0:properties[1]/documentManagement[1]/ns3:Date_approbation[1]" w:storeItemID="{1159403A-C237-488E-8C5E-DABF9FCE7043}"/>
-              <w:date w:fullDate="2025-01-21T00:00:00Z">
+              <w:date w:fullDate="2025-11-18T00:00:00Z">
                 <w:dateFormat w:val="dd/MM/yyyy"/>
                 <w:lid w:val="fr-FR"/>
                 <w:storeMappedDataAs w:val="dateTime"/>
@@ -888,14 +898,21 @@
                     <w:rFonts w:cs="Arial"/>
                     <w:szCs w:val="18"/>
                   </w:rPr>
-                  <w:t>21/0</w:t>
+                  <w:t>18</w:t>
                 </w:r>
                 <w:r>
                   <w:rPr>
                     <w:rFonts w:cs="Arial"/>
                     <w:szCs w:val="18"/>
                   </w:rPr>
-                  <w:t>1</w:t>
+                  <w:t>/</w:t>
+                </w:r>
+                <w:r>
+                  <w:rPr>
+                    <w:rFonts w:cs="Arial"/>
+                    <w:szCs w:val="18"/>
+                  </w:rPr>
+                  <w:t>11</w:t>
                 </w:r>
                 <w:r>
                   <w:rPr>
@@ -1135,7 +1152,35 @@
                 <w:rFonts w:cs="Arial"/>
                 <w:szCs w:val="18"/>
               </w:rPr>
-              <w:t>21/03/2024</w:t>
+              <w:t>18</w:t>
+            </w:r>
+            <w:r>
+              <w:rPr>
+                <w:rFonts w:cs="Arial"/>
+                <w:szCs w:val="18"/>
+              </w:rPr>
+              <w:t>/</w:t>
+            </w:r>
+            <w:r>
+              <w:rPr>
+                <w:rFonts w:cs="Arial"/>
+                <w:szCs w:val="18"/>
+              </w:rPr>
+              <w:t>11</w:t>
+            </w:r>
+            <w:r>
+              <w:rPr>
+                <w:rFonts w:cs="Arial"/>
+                <w:szCs w:val="18"/>
+              </w:rPr>
+              <w:t>/</w:t>
+            </w:r>
+            <w:r>
+              <w:rPr>
+                <w:rFonts w:cs="Arial"/>
+                <w:szCs w:val="18"/>
+              </w:rPr>
+              <w:t>2025</w:t>
             </w:r>
           </w:p>
         </w:tc>
@@ -1260,7 +1305,7 @@
           <w:r>
             <w:fldChar w:fldCharType="separate"/>
           </w:r>
-          <w:hyperlink w:anchor="_Toc204246302" w:history="1">
+          <w:hyperlink w:anchor="_Toc214450481" w:history="1">
             <w:r>
               <w:rPr>
                 <w:rStyle w:val="Lienhypertexte"/>
@@ -1298,7 +1343,7 @@
               <w:rPr>
                 <w:webHidden/>
               </w:rPr>
-              <w:instrText xml:space="preserve"> PAGEREF _Toc204246302 \h </w:instrText>
+              <w:instrText xml:space="preserve"> PAGEREF _Toc214450481 \h </w:instrText>
             </w:r>
             <w:r>
               <w:rPr>
@@ -1335,7 +1380,7 @@
               <w:szCs w:val="22"/>
             </w:rPr>
           </w:pPr>
-          <w:hyperlink w:anchor="_Toc204246303" w:history="1">
+          <w:hyperlink w:anchor="_Toc214450482" w:history="1">
             <w:r>
               <w:rPr>
                 <w:rStyle w:val="Lienhypertexte"/>
@@ -1373,7 +1418,7 @@
               <w:rPr>
                 <w:webHidden/>
               </w:rPr>
-              <w:instrText xml:space="preserve"> PAGEREF _Toc204246303 \h </w:instrText>
+              <w:instrText xml:space="preserve"> PAGEREF _Toc214450482 \h </w:instrText>
             </w:r>
             <w:r>
               <w:rPr>
@@ -1410,7 +1455,7 @@
               <w:szCs w:val="22"/>
             </w:rPr>
           </w:pPr>
-          <w:hyperlink w:anchor="_Toc204246304" w:history="1">
+          <w:hyperlink w:anchor="_Toc214450483" w:history="1">
             <w:r>
               <w:rPr>
                 <w:rStyle w:val="Lienhypertexte"/>
@@ -1448,7 +1493,7 @@
               <w:rPr>
                 <w:webHidden/>
               </w:rPr>
-              <w:instrText xml:space="preserve"> PAGEREF _Toc204246304 \h </w:instrText>
+              <w:instrText xml:space="preserve"> PAGEREF _Toc214450483 \h </w:instrText>
             </w:r>
             <w:r>
               <w:rPr>
@@ -1485,7 +1530,7 @@
               <w:szCs w:val="22"/>
             </w:rPr>
           </w:pPr>
-          <w:hyperlink w:anchor="_Toc204246305" w:history="1">
+          <w:hyperlink w:anchor="_Toc214450484" w:history="1">
             <w:r>
               <w:rPr>
                 <w:rStyle w:val="Lienhypertexte"/>
@@ -1523,7 +1568,7 @@
               <w:rPr>
                 <w:webHidden/>
               </w:rPr>
-              <w:instrText xml:space="preserve"> PAGEREF _Toc204246305 \h </w:instrText>
+              <w:instrText xml:space="preserve"> PAGEREF _Toc214450484 \h </w:instrText>
             </w:r>
             <w:r>
               <w:rPr>
@@ -1560,7 +1605,7 @@
               <w:szCs w:val="22"/>
             </w:rPr>
           </w:pPr>
-          <w:hyperlink w:anchor="_Toc204246306" w:history="1">
+          <w:hyperlink w:anchor="_Toc214450485" w:history="1">
             <w:r>
               <w:rPr>
                 <w:rStyle w:val="Lienhypertexte"/>
@@ -1580,7 +1625,7 @@
               <w:rPr>
                 <w:rStyle w:val="Lienhypertexte"/>
               </w:rPr>
-              <w:t>Mode de sélection</w:t>
+              <w:t>Filtrage des champs</w:t>
             </w:r>
             <w:r>
               <w:rPr>
@@ -1598,7 +1643,7 @@
               <w:rPr>
                 <w:webHidden/>
               </w:rPr>
-              <w:instrText xml:space="preserve"> PAGEREF _Toc204246306 \h </w:instrText>
+              <w:instrText xml:space="preserve"> PAGEREF _Toc214450485 \h </w:instrText>
             </w:r>
             <w:r>
               <w:rPr>
@@ -1634,7 +1679,7 @@
               <w:szCs w:val="22"/>
             </w:rPr>
           </w:pPr>
-          <w:hyperlink w:anchor="_Toc204246307" w:history="1">
+          <w:hyperlink w:anchor="_Toc214450486" w:history="1">
             <w:r>
               <w:rPr>
                 <w:rStyle w:val="Lienhypertexte"/>
@@ -1653,7 +1698,7 @@
               <w:rPr>
                 <w:rStyle w:val="Lienhypertexte"/>
               </w:rPr>
-              <w:t>Sélection unique</w:t>
+              <w:t>Sélection unique / multiple</w:t>
             </w:r>
             <w:r>
               <w:rPr>
@@ -1671,7 +1716,7 @@
               <w:rPr>
                 <w:webHidden/>
               </w:rPr>
-              <w:instrText xml:space="preserve"> PAGEREF _Toc204246307 \h </w:instrText>
+              <w:instrText xml:space="preserve"> PAGEREF _Toc214450486 \h </w:instrText>
             </w:r>
             <w:r>
               <w:rPr>
@@ -1707,7 +1752,7 @@
               <w:szCs w:val="22"/>
             </w:rPr>
           </w:pPr>
-          <w:hyperlink w:anchor="_Toc204246308" w:history="1">
+          <w:hyperlink w:anchor="_Toc214450487" w:history="1">
             <w:r>
               <w:rPr>
                 <w:rStyle w:val="Lienhypertexte"/>
@@ -1726,7 +1771,60 @@
               <w:rPr>
                 <w:rStyle w:val="Lienhypertexte"/>
               </w:rPr>
-              <w:t>Sélection multiple</w:t>
+              <w:t xml:space="preserve">Sélection via </w:t>
+            </w:r>
+            <w:r>
+              <w:rPr>
+                <w:rStyle w:val="Lienhypertexte"/>
+              </w:rPr>
+              <w:drawing>
+                <wp:inline distT="0" distB="0" distL="0" distR="0" wp14:anchorId="09BCD6E0" wp14:editId="2C8C0F24">
+                  <wp:extent cx="214685" cy="190178"/>
+                  <wp:effectExtent l="0" t="0" r="0" b="635"/>
+                  <wp:docPr id="44" name="Image 44"/>
+                  <wp:cNvGraphicFramePr>
+                    <a:graphicFrameLocks xmlns:a="http://schemas.openxmlformats.org/drawingml/2006/main" noChangeAspect="1"/>
+                  </wp:cNvGraphicFramePr>
+                  <a:graphic xmlns:a="http://schemas.openxmlformats.org/drawingml/2006/main">
+                    <a:graphicData uri="http://schemas.openxmlformats.org/drawingml/2006/picture">
+                      <pic:pic xmlns:pic="http://schemas.openxmlformats.org/drawingml/2006/picture">
+                        <pic:nvPicPr>
+                          <pic:cNvPr id="0" name="Picture 13"/>
+                          <pic:cNvPicPr>
+                            <a:picLocks noChangeAspect="1" noChangeArrowheads="1"/>
+                          </pic:cNvPicPr>
+                        </pic:nvPicPr>
+                        <pic:blipFill>
+                          <a:blip r:embed="rId12">
+                            <a:extLst>
+                              <a:ext uri="{28A0092B-C50C-407E-A947-70E740481C1C}">
+                                <a14:useLocalDpi xmlns:a14="http://schemas.microsoft.com/office/drawing/2010/main" val="0"/>
+                              </a:ext>
+                            </a:extLst>
+                          </a:blip>
+                          <a:srcRect/>
+                          <a:stretch>
+                            <a:fillRect/>
+                          </a:stretch>
+                        </pic:blipFill>
+                        <pic:spPr bwMode="auto">
+                          <a:xfrm>
+                            <a:off x="0" y="0"/>
+                            <a:ext cx="216366" cy="191667"/>
+                          </a:xfrm>
+                          <a:prstGeom prst="rect">
+                            <a:avLst/>
+                          </a:prstGeom>
+                          <a:noFill/>
+                          <a:ln>
+                            <a:noFill/>
+                          </a:ln>
+                        </pic:spPr>
+                      </pic:pic>
+                    </a:graphicData>
+                  </a:graphic>
+                </wp:inline>
+              </w:drawing>
             </w:r>
             <w:r>
               <w:rPr>
@@ -1744,7 +1842,7 @@
               <w:rPr>
                 <w:webHidden/>
               </w:rPr>
-              <w:instrText xml:space="preserve"> PAGEREF _Toc204246308 \h </w:instrText>
+              <w:instrText xml:space="preserve"> PAGEREF _Toc214450487 \h </w:instrText>
             </w:r>
             <w:r>
               <w:rPr>
@@ -1761,7 +1859,7 @@
               <w:rPr>
                 <w:webHidden/>
               </w:rPr>
-              <w:t>4</w:t>
+              <w:t>5</w:t>
             </w:r>
             <w:r>
               <w:rPr>
@@ -1781,7 +1879,7 @@
               <w:szCs w:val="22"/>
             </w:rPr>
           </w:pPr>
-          <w:hyperlink w:anchor="_Toc204246309" w:history="1">
+          <w:hyperlink w:anchor="_Toc214450488" w:history="1">
             <w:r>
               <w:rPr>
                 <w:rStyle w:val="Lienhypertexte"/>
@@ -1801,7 +1899,7 @@
               <w:rPr>
                 <w:rStyle w:val="Lienhypertexte"/>
               </w:rPr>
-              <w:t>Modification</w:t>
+              <w:t>Modification des valeurs des champs</w:t>
             </w:r>
             <w:r>
               <w:rPr>
@@ -1819,7 +1917,7 @@
               <w:rPr>
                 <w:webHidden/>
               </w:rPr>
-              <w:instrText xml:space="preserve"> PAGEREF _Toc204246309 \h </w:instrText>
+              <w:instrText xml:space="preserve"> PAGEREF _Toc214450488 \h </w:instrText>
             </w:r>
             <w:r>
               <w:rPr>
@@ -1856,7 +1954,7 @@
               <w:szCs w:val="22"/>
             </w:rPr>
           </w:pPr>
-          <w:hyperlink w:anchor="_Toc204246310" w:history="1">
+          <w:hyperlink w:anchor="_Toc214450489" w:history="1">
             <w:r>
               <w:rPr>
                 <w:rStyle w:val="Lienhypertexte"/>
@@ -1876,7 +1974,7 @@
               <w:rPr>
                 <w:rStyle w:val="Lienhypertexte"/>
               </w:rPr>
-              <w:t>Extra</w:t>
+              <w:t>Modification de l’ordre d’affichage des « widgets »</w:t>
             </w:r>
             <w:r>
               <w:rPr>
@@ -1894,80 +1992,7 @@
               <w:rPr>
                 <w:webHidden/>
               </w:rPr>
-              <w:instrText xml:space="preserve"> PAGEREF _Toc204246310 \h </w:instrText>
-            </w:r>
-            <w:r>
-              <w:rPr>
-                <w:webHidden/>
-              </w:rPr>
-            </w:r>
-            <w:r>
-              <w:rPr>
-                <w:webHidden/>
-              </w:rPr>
-              <w:fldChar w:fldCharType="separate"/>
-            </w:r>
-            <w:r>
-              <w:rPr>
-                <w:webHidden/>
-              </w:rPr>
-              <w:t>6</w:t>
-            </w:r>
-            <w:r>
-              <w:rPr>
-                <w:webHidden/>
-              </w:rPr>
-              <w:fldChar w:fldCharType="end"/>
-            </w:r>
-          </w:hyperlink>
-        </w:p>
-        <w:p>
-          <w:pPr>
-            <w:pStyle w:val="TM2"/>
-            <w:rPr>
-              <w:rFonts w:asciiTheme="minorHAnsi" w:eastAsiaTheme="minorEastAsia" w:hAnsiTheme="minorHAnsi" w:cstheme="minorBidi"/>
-              <w:sz w:val="22"/>
-              <w:szCs w:val="22"/>
-            </w:rPr>
-          </w:pPr>
-          <w:hyperlink w:anchor="_Toc204246311" w:history="1">
-            <w:r>
-              <w:rPr>
-                <w:rStyle w:val="Lienhypertexte"/>
-              </w:rPr>
-              <w:t>7.1</w:t>
-            </w:r>
-            <w:r>
-              <w:rPr>
-                <w:rFonts w:asciiTheme="minorHAnsi" w:eastAsiaTheme="minorEastAsia" w:hAnsiTheme="minorHAnsi" w:cstheme="minorBidi"/>
-                <w:sz w:val="22"/>
-                <w:szCs w:val="22"/>
-              </w:rPr>
-              <w:tab/>
-            </w:r>
-            <w:r>
-              <w:rPr>
-                <w:rStyle w:val="Lienhypertexte"/>
-              </w:rPr>
-              <w:t>A propos</w:t>
-            </w:r>
-            <w:r>
-              <w:rPr>
-                <w:webHidden/>
-              </w:rPr>
-              <w:tab/>
-            </w:r>
-            <w:r>
-              <w:rPr>
-                <w:webHidden/>
-              </w:rPr>
-              <w:fldChar w:fldCharType="begin"/>
-            </w:r>
-            <w:r>
-              <w:rPr>
-                <w:webHidden/>
-              </w:rPr>
-              <w:instrText xml:space="preserve"> PAGEREF _Toc204246311 \h </w:instrText>
+              <w:instrText xml:space="preserve"> PAGEREF _Toc214450489 \h </w:instrText>
             </w:r>
             <w:r>
               <w:rPr>
@@ -2004,7 +2029,7 @@
               <w:szCs w:val="22"/>
             </w:rPr>
           </w:pPr>
-          <w:hyperlink w:anchor="_Toc204246312" w:history="1">
+          <w:hyperlink w:anchor="_Toc214450490" w:history="1">
             <w:r>
               <w:rPr>
                 <w:rStyle w:val="Lienhypertexte"/>
@@ -2024,7 +2049,7 @@
               <w:rPr>
                 <w:rStyle w:val="Lienhypertexte"/>
               </w:rPr>
-              <w:t>Annexes</w:t>
+              <w:t>Paramétrage des préférences de l’interface</w:t>
             </w:r>
             <w:r>
               <w:rPr>
@@ -2042,7 +2067,7 @@
               <w:rPr>
                 <w:webHidden/>
               </w:rPr>
-              <w:instrText xml:space="preserve"> PAGEREF _Toc204246312 \h </w:instrText>
+              <w:instrText xml:space="preserve"> PAGEREF _Toc214450490 \h </w:instrText>
             </w:r>
             <w:r>
               <w:rPr>
@@ -2059,7 +2084,7 @@
               <w:rPr>
                 <w:webHidden/>
               </w:rPr>
-              <w:t>7</w:t>
+              <w:t>6</w:t>
             </w:r>
             <w:r>
               <w:rPr>
@@ -2071,23 +2096,25 @@
         </w:p>
         <w:p>
           <w:pPr>
-            <w:pStyle w:val="TM2"/>
+            <w:pStyle w:val="TM1"/>
             <w:rPr>
               <w:rFonts w:asciiTheme="minorHAnsi" w:eastAsiaTheme="minorEastAsia" w:hAnsiTheme="minorHAnsi" w:cstheme="minorBidi"/>
+              <w:smallCaps w:val="0"/>
               <w:sz w:val="22"/>
               <w:szCs w:val="22"/>
             </w:rPr>
           </w:pPr>
-          <w:hyperlink w:anchor="_Toc204246313" w:history="1">
+          <w:hyperlink w:anchor="_Toc214450491" w:history="1">
             <w:r>
               <w:rPr>
                 <w:rStyle w:val="Lienhypertexte"/>
               </w:rPr>
-              <w:t>8.1</w:t>
+              <w:t>9</w:t>
             </w:r>
             <w:r>
               <w:rPr>
                 <w:rFonts w:asciiTheme="minorHAnsi" w:eastAsiaTheme="minorEastAsia" w:hAnsiTheme="minorHAnsi" w:cstheme="minorBidi"/>
+                <w:smallCaps w:val="0"/>
                 <w:sz w:val="22"/>
                 <w:szCs w:val="22"/>
               </w:rPr>
@@ -2097,7 +2124,7 @@
               <w:rPr>
                 <w:rStyle w:val="Lienhypertexte"/>
               </w:rPr>
-              <w:t>Installation du package openyxl</w:t>
+              <w:t>A propos</w:t>
             </w:r>
             <w:r>
               <w:rPr>
@@ -2115,7 +2142,7 @@
               <w:rPr>
                 <w:webHidden/>
               </w:rPr>
-              <w:instrText xml:space="preserve"> PAGEREF _Toc204246313 \h </w:instrText>
+              <w:instrText xml:space="preserve"> PAGEREF _Toc214450491 \h </w:instrText>
             </w:r>
             <w:r>
               <w:rPr>
@@ -2185,7 +2212,7 @@
       <w:pPr>
         <w:pStyle w:val="Titre1"/>
       </w:pPr>
-      <w:bookmarkStart w:id="1" w:name="_Toc204246302"/>
+      <w:bookmarkStart w:id="1" w:name="_Toc214450481"/>
       <w:r>
         <w:t>Prérequis</w:t>
       </w:r>
@@ -2208,13 +2235,44 @@
         <w:t xml:space="preserve">avec le plugin </w:t>
       </w:r>
       <w:r>
-        <w:t>IGN</w:t>
-      </w:r>
-      <w:r>
-        <w:t xml:space="preserve"> </w:t>
-      </w:r>
-      <w:r>
-        <w:t>Maitre.</w:t>
+        <w:t>« m</w:t>
+      </w:r>
+      <w:r>
+        <w:t>aitre</w:t>
+      </w:r>
+      <w:r>
+        <w:t> »</w:t>
+      </w:r>
+      <w:r>
+        <w:t>.</w:t>
+      </w:r>
+    </w:p>
+    <w:p/>
+    <w:p>
+      <w:pPr>
+        <w:pStyle w:val="Titre1"/>
+      </w:pPr>
+      <w:bookmarkStart w:id="2" w:name="_Toc214450482"/>
+      <w:r>
+        <w:t>Résumé</w:t>
+      </w:r>
+      <w:bookmarkEnd w:id="2"/>
+    </w:p>
+    <w:p/>
+    <w:p>
+      <w:r>
+        <w:t xml:space="preserve">Ce plugin est une aide à la </w:t>
+      </w:r>
+      <w:r>
+        <w:t xml:space="preserve">modification des attributs </w:t>
+      </w:r>
+      <w:r>
+        <w:t>des différents champs.</w:t>
+      </w:r>
+    </w:p>
+    <w:p>
+      <w:r>
+        <w:t>Un filtre permet de sélectionner uniquement les champs que l’on veut modifier.</w:t>
       </w:r>
     </w:p>
     <w:p/>
@@ -2223,45 +2281,31 @@
       <w:pPr>
         <w:pStyle w:val="Titre1"/>
       </w:pPr>
-      <w:bookmarkStart w:id="2" w:name="_Toc204246303"/>
-      <w:r>
-        <w:t>Résumé</w:t>
-      </w:r>
-      <w:bookmarkEnd w:id="2"/>
+      <w:bookmarkStart w:id="3" w:name="_Toc214450483"/>
+      <w:r>
+        <w:t>Installation</w:t>
+      </w:r>
+      <w:bookmarkEnd w:id="3"/>
     </w:p>
     <w:p/>
     <w:p>
       <w:r>
-        <w:t xml:space="preserve">Ce plugin est une aide à la </w:t>
-      </w:r>
-      <w:r>
-        <w:t xml:space="preserve">modification des attributs </w:t>
-      </w:r>
-      <w:r>
-        <w:t>des différents champs.</w:t>
-      </w:r>
-    </w:p>
-    <w:p>
-      <w:r>
-        <w:t>Un filtre permet de sélectionner uniquement les champs que l’on veut modifier.</w:t>
+        <w:t>Au préalable il faut installer le plugin « Maitre », c’est lui qui gère l’intégration du plugin dans le menu IGN et / ou dans les barres d’outils. Sans lui le plugin « jeux d’attributs</w:t>
+      </w:r>
+      <w:r>
+        <w:t xml:space="preserve"> génériques</w:t>
+      </w:r>
+      <w:r>
+        <w:t> » ne sera pas accessible.</w:t>
       </w:r>
     </w:p>
     <w:p/>
-    <w:p/>
-    <w:p>
-      <w:pPr>
-        <w:pStyle w:val="Titre1"/>
-      </w:pPr>
-      <w:bookmarkStart w:id="3" w:name="_Toc204246304"/>
-      <w:r>
-        <w:t>Installation</w:t>
-      </w:r>
-      <w:bookmarkEnd w:id="3"/>
-    </w:p>
-    <w:p/>
-    <w:p>
-      <w:r>
-        <w:t>Au préalable il faut installer le plugin « Maitre », c’est lui qui gère l’intégration du plugin dans le menu IGN et / ou dans les barres d’outils. Sans lui le plugin « jeux d’attributs » ne sera pas accessible.</w:t>
+    <w:p>
+      <w:r>
+        <w:t>Le plugin « espace collaboratif » doit également être installé afin d’impacter les modifications des couches vers les serveurs IGN</w:t>
+      </w:r>
+      <w:r>
+        <w:t>, sinon seules les données locales seront modifiées.</w:t>
       </w:r>
     </w:p>
     <w:p/>
@@ -2330,7 +2374,7 @@
                     <pic:cNvPicPr/>
                   </pic:nvPicPr>
                   <pic:blipFill>
-                    <a:blip r:embed="rId12"/>
+                    <a:blip r:embed="rId13"/>
                     <a:stretch>
                       <a:fillRect/>
                     </a:stretch>
@@ -2366,7 +2410,7 @@
       <w:pPr>
         <w:pStyle w:val="Titre1"/>
       </w:pPr>
-      <w:bookmarkStart w:id="4" w:name="_Toc204246305"/>
+      <w:bookmarkStart w:id="4" w:name="_Toc214450484"/>
       <w:r>
         <w:t>Présentation</w:t>
       </w:r>
@@ -2383,8 +2427,799 @@
           <w:noProof/>
         </w:rPr>
         <w:drawing>
-          <wp:inline distT="0" distB="0" distL="0" distR="0" wp14:anchorId="2D4121F9" wp14:editId="36C10CC6">
-            <wp:extent cx="6153150" cy="2838450"/>
+          <wp:inline distT="0" distB="0" distL="0" distR="0" wp14:anchorId="19CCA083" wp14:editId="7D93261C">
+            <wp:extent cx="3912235" cy="723265"/>
+            <wp:effectExtent l="0" t="0" r="0" b="635"/>
+            <wp:docPr id="5" name="Image 5"/>
+            <wp:cNvGraphicFramePr>
+              <a:graphicFrameLocks xmlns:a="http://schemas.openxmlformats.org/drawingml/2006/main" noChangeAspect="1"/>
+            </wp:cNvGraphicFramePr>
+            <a:graphic xmlns:a="http://schemas.openxmlformats.org/drawingml/2006/main">
+              <a:graphicData uri="http://schemas.openxmlformats.org/drawingml/2006/picture">
+                <pic:pic xmlns:pic="http://schemas.openxmlformats.org/drawingml/2006/picture">
+                  <pic:nvPicPr>
+                    <pic:cNvPr id="0" name="Picture 1"/>
+                    <pic:cNvPicPr>
+                      <a:picLocks noChangeAspect="1" noChangeArrowheads="1"/>
+                    </pic:cNvPicPr>
+                  </pic:nvPicPr>
+                  <pic:blipFill>
+                    <a:blip r:embed="rId14">
+                      <a:extLst>
+                        <a:ext uri="{28A0092B-C50C-407E-A947-70E740481C1C}">
+                          <a14:useLocalDpi xmlns:a14="http://schemas.microsoft.com/office/drawing/2010/main" val="0"/>
+                        </a:ext>
+                      </a:extLst>
+                    </a:blip>
+                    <a:srcRect/>
+                    <a:stretch>
+                      <a:fillRect/>
+                    </a:stretch>
+                  </pic:blipFill>
+                  <pic:spPr bwMode="auto">
+                    <a:xfrm>
+                      <a:off x="0" y="0"/>
+                      <a:ext cx="3912235" cy="723265"/>
+                    </a:xfrm>
+                    <a:prstGeom prst="rect">
+                      <a:avLst/>
+                    </a:prstGeom>
+                    <a:noFill/>
+                    <a:ln>
+                      <a:noFill/>
+                    </a:ln>
+                  </pic:spPr>
+                </pic:pic>
+              </a:graphicData>
+            </a:graphic>
+          </wp:inline>
+        </w:drawing>
+      </w:r>
+      <w:r>
+        <w:rPr>
+          <w:noProof/>
+        </w:rPr>
+        <w:t xml:space="preserve"> </w:t>
+      </w:r>
+    </w:p>
+    <w:p>
+      <w:pPr>
+        <w:jc w:val="center"/>
+      </w:pPr>
+    </w:p>
+    <w:p>
+      <w:r>
+        <w:t>Lors de la première ouverture de l’interface, seul les boutons par défauts apparaissent.</w:t>
+      </w:r>
+    </w:p>
+    <w:p>
+      <w:r>
+        <w:t>En effet le filtrage des champs est pour l’instant vide.</w:t>
+      </w:r>
+    </w:p>
+    <w:p/>
+    <w:p>
+      <w:r>
+        <w:t xml:space="preserve"> </w:t>
+      </w:r>
+      <w:r>
+        <w:rPr>
+          <w:noProof/>
+        </w:rPr>
+        <w:drawing>
+          <wp:inline distT="0" distB="0" distL="0" distR="0" wp14:anchorId="6E280F2C" wp14:editId="79597D87">
+            <wp:extent cx="254635" cy="254635"/>
+            <wp:effectExtent l="0" t="0" r="0" b="0"/>
+            <wp:docPr id="6" name="Image 6"/>
+            <wp:cNvGraphicFramePr>
+              <a:graphicFrameLocks xmlns:a="http://schemas.openxmlformats.org/drawingml/2006/main" noChangeAspect="1"/>
+            </wp:cNvGraphicFramePr>
+            <a:graphic xmlns:a="http://schemas.openxmlformats.org/drawingml/2006/main">
+              <a:graphicData uri="http://schemas.openxmlformats.org/drawingml/2006/picture">
+                <pic:pic xmlns:pic="http://schemas.openxmlformats.org/drawingml/2006/picture">
+                  <pic:nvPicPr>
+                    <pic:cNvPr id="0" name="Picture 2"/>
+                    <pic:cNvPicPr>
+                      <a:picLocks noChangeAspect="1" noChangeArrowheads="1"/>
+                    </pic:cNvPicPr>
+                  </pic:nvPicPr>
+                  <pic:blipFill>
+                    <a:blip r:embed="rId15">
+                      <a:extLst>
+                        <a:ext uri="{28A0092B-C50C-407E-A947-70E740481C1C}">
+                          <a14:useLocalDpi xmlns:a14="http://schemas.microsoft.com/office/drawing/2010/main" val="0"/>
+                        </a:ext>
+                      </a:extLst>
+                    </a:blip>
+                    <a:srcRect/>
+                    <a:stretch>
+                      <a:fillRect/>
+                    </a:stretch>
+                  </pic:blipFill>
+                  <pic:spPr bwMode="auto">
+                    <a:xfrm>
+                      <a:off x="0" y="0"/>
+                      <a:ext cx="254635" cy="254635"/>
+                    </a:xfrm>
+                    <a:prstGeom prst="rect">
+                      <a:avLst/>
+                    </a:prstGeom>
+                    <a:noFill/>
+                    <a:ln>
+                      <a:noFill/>
+                    </a:ln>
+                  </pic:spPr>
+                </pic:pic>
+              </a:graphicData>
+            </a:graphic>
+          </wp:inline>
+        </w:drawing>
+      </w:r>
+      <w:r>
+        <w:t> </w:t>
+      </w:r>
+      <w:r>
+        <w:tab/>
+        <w:t>P</w:t>
+      </w:r>
+      <w:r>
+        <w:t>ermet de configurer le filtrage des champs.</w:t>
+      </w:r>
+    </w:p>
+    <w:p>
+      <w:r>
+        <w:rPr>
+          <w:noProof/>
+        </w:rPr>
+        <w:drawing>
+          <wp:inline distT="0" distB="0" distL="0" distR="0" wp14:anchorId="72ED9F48" wp14:editId="19FA37E1">
+            <wp:extent cx="238760" cy="246380"/>
+            <wp:effectExtent l="0" t="0" r="8890" b="1270"/>
+            <wp:docPr id="7" name="Image 7"/>
+            <wp:cNvGraphicFramePr>
+              <a:graphicFrameLocks xmlns:a="http://schemas.openxmlformats.org/drawingml/2006/main" noChangeAspect="1"/>
+            </wp:cNvGraphicFramePr>
+            <a:graphic xmlns:a="http://schemas.openxmlformats.org/drawingml/2006/main">
+              <a:graphicData uri="http://schemas.openxmlformats.org/drawingml/2006/picture">
+                <pic:pic xmlns:pic="http://schemas.openxmlformats.org/drawingml/2006/picture">
+                  <pic:nvPicPr>
+                    <pic:cNvPr id="0" name="Picture 3"/>
+                    <pic:cNvPicPr>
+                      <a:picLocks noChangeAspect="1" noChangeArrowheads="1"/>
+                    </pic:cNvPicPr>
+                  </pic:nvPicPr>
+                  <pic:blipFill>
+                    <a:blip r:embed="rId16">
+                      <a:extLst>
+                        <a:ext uri="{28A0092B-C50C-407E-A947-70E740481C1C}">
+                          <a14:useLocalDpi xmlns:a14="http://schemas.microsoft.com/office/drawing/2010/main" val="0"/>
+                        </a:ext>
+                      </a:extLst>
+                    </a:blip>
+                    <a:srcRect/>
+                    <a:stretch>
+                      <a:fillRect/>
+                    </a:stretch>
+                  </pic:blipFill>
+                  <pic:spPr bwMode="auto">
+                    <a:xfrm>
+                      <a:off x="0" y="0"/>
+                      <a:ext cx="238760" cy="246380"/>
+                    </a:xfrm>
+                    <a:prstGeom prst="rect">
+                      <a:avLst/>
+                    </a:prstGeom>
+                    <a:noFill/>
+                    <a:ln>
+                      <a:noFill/>
+                    </a:ln>
+                  </pic:spPr>
+                </pic:pic>
+              </a:graphicData>
+            </a:graphic>
+          </wp:inline>
+        </w:drawing>
+      </w:r>
+      <w:r>
+        <w:tab/>
+        <w:t>Permet</w:t>
+      </w:r>
+      <w:r>
+        <w:t xml:space="preserve"> de paramétrer l’interface (couleurs, nombre de boutons par ligne)</w:t>
+      </w:r>
+    </w:p>
+    <w:p>
+      <w:r>
+        <w:rPr>
+          <w:noProof/>
+        </w:rPr>
+        <w:drawing>
+          <wp:inline distT="0" distB="0" distL="0" distR="0" wp14:anchorId="422C55EF" wp14:editId="6448F418">
+            <wp:extent cx="254635" cy="238760"/>
+            <wp:effectExtent l="0" t="0" r="0" b="8890"/>
+            <wp:docPr id="11" name="Image 11"/>
+            <wp:cNvGraphicFramePr>
+              <a:graphicFrameLocks xmlns:a="http://schemas.openxmlformats.org/drawingml/2006/main" noChangeAspect="1"/>
+            </wp:cNvGraphicFramePr>
+            <a:graphic xmlns:a="http://schemas.openxmlformats.org/drawingml/2006/main">
+              <a:graphicData uri="http://schemas.openxmlformats.org/drawingml/2006/picture">
+                <pic:pic xmlns:pic="http://schemas.openxmlformats.org/drawingml/2006/picture">
+                  <pic:nvPicPr>
+                    <pic:cNvPr id="0" name="Picture 4"/>
+                    <pic:cNvPicPr>
+                      <a:picLocks noChangeAspect="1" noChangeArrowheads="1"/>
+                    </pic:cNvPicPr>
+                  </pic:nvPicPr>
+                  <pic:blipFill>
+                    <a:blip r:embed="rId17">
+                      <a:extLst>
+                        <a:ext uri="{28A0092B-C50C-407E-A947-70E740481C1C}">
+                          <a14:useLocalDpi xmlns:a14="http://schemas.microsoft.com/office/drawing/2010/main" val="0"/>
+                        </a:ext>
+                      </a:extLst>
+                    </a:blip>
+                    <a:srcRect/>
+                    <a:stretch>
+                      <a:fillRect/>
+                    </a:stretch>
+                  </pic:blipFill>
+                  <pic:spPr bwMode="auto">
+                    <a:xfrm>
+                      <a:off x="0" y="0"/>
+                      <a:ext cx="254635" cy="238760"/>
+                    </a:xfrm>
+                    <a:prstGeom prst="rect">
+                      <a:avLst/>
+                    </a:prstGeom>
+                    <a:noFill/>
+                    <a:ln>
+                      <a:noFill/>
+                    </a:ln>
+                  </pic:spPr>
+                </pic:pic>
+              </a:graphicData>
+            </a:graphic>
+          </wp:inline>
+        </w:drawing>
+      </w:r>
+      <w:r>
+        <w:tab/>
+        <w:t>Afficher / Masquer le sens de numérisation des linéaires</w:t>
+      </w:r>
+    </w:p>
+    <w:p>
+      <w:pPr>
+        <w:ind w:left="705" w:hanging="705"/>
+      </w:pPr>
+      <w:r>
+        <w:rPr>
+          <w:noProof/>
+        </w:rPr>
+        <w:drawing>
+          <wp:inline distT="0" distB="0" distL="0" distR="0" wp14:anchorId="4C9320E0" wp14:editId="64B82608">
+            <wp:extent cx="278130" cy="246380"/>
+            <wp:effectExtent l="0" t="0" r="7620" b="1270"/>
+            <wp:docPr id="13" name="Image 13"/>
+            <wp:cNvGraphicFramePr>
+              <a:graphicFrameLocks xmlns:a="http://schemas.openxmlformats.org/drawingml/2006/main" noChangeAspect="1"/>
+            </wp:cNvGraphicFramePr>
+            <a:graphic xmlns:a="http://schemas.openxmlformats.org/drawingml/2006/main">
+              <a:graphicData uri="http://schemas.openxmlformats.org/drawingml/2006/picture">
+                <pic:pic xmlns:pic="http://schemas.openxmlformats.org/drawingml/2006/picture">
+                  <pic:nvPicPr>
+                    <pic:cNvPr id="0" name="Picture 5"/>
+                    <pic:cNvPicPr>
+                      <a:picLocks noChangeAspect="1" noChangeArrowheads="1"/>
+                    </pic:cNvPicPr>
+                  </pic:nvPicPr>
+                  <pic:blipFill>
+                    <a:blip r:embed="rId12">
+                      <a:extLst>
+                        <a:ext uri="{28A0092B-C50C-407E-A947-70E740481C1C}">
+                          <a14:useLocalDpi xmlns:a14="http://schemas.microsoft.com/office/drawing/2010/main" val="0"/>
+                        </a:ext>
+                      </a:extLst>
+                    </a:blip>
+                    <a:srcRect/>
+                    <a:stretch>
+                      <a:fillRect/>
+                    </a:stretch>
+                  </pic:blipFill>
+                  <pic:spPr bwMode="auto">
+                    <a:xfrm>
+                      <a:off x="0" y="0"/>
+                      <a:ext cx="278130" cy="246380"/>
+                    </a:xfrm>
+                    <a:prstGeom prst="rect">
+                      <a:avLst/>
+                    </a:prstGeom>
+                    <a:noFill/>
+                    <a:ln>
+                      <a:noFill/>
+                    </a:ln>
+                  </pic:spPr>
+                </pic:pic>
+              </a:graphicData>
+            </a:graphic>
+          </wp:inline>
+        </w:drawing>
+      </w:r>
+      <w:r>
+        <w:tab/>
+        <w:t>Permet de sélectionner toutes les entités comprises entres deux linéaires en suivant l’algorithme du « chemin le plus court »</w:t>
+      </w:r>
+    </w:p>
+    <w:p>
+      <w:pPr>
+        <w:ind w:left="705" w:hanging="705"/>
+      </w:pPr>
+      <w:r>
+        <w:rPr>
+          <w:noProof/>
+        </w:rPr>
+        <w:drawing>
+          <wp:inline distT="0" distB="0" distL="0" distR="0" wp14:anchorId="5116ED9F" wp14:editId="1FAA1F73">
+            <wp:extent cx="278130" cy="254635"/>
+            <wp:effectExtent l="0" t="0" r="7620" b="0"/>
+            <wp:docPr id="17" name="Image 17"/>
+            <wp:cNvGraphicFramePr>
+              <a:graphicFrameLocks xmlns:a="http://schemas.openxmlformats.org/drawingml/2006/main" noChangeAspect="1"/>
+            </wp:cNvGraphicFramePr>
+            <a:graphic xmlns:a="http://schemas.openxmlformats.org/drawingml/2006/main">
+              <a:graphicData uri="http://schemas.openxmlformats.org/drawingml/2006/picture">
+                <pic:pic xmlns:pic="http://schemas.openxmlformats.org/drawingml/2006/picture">
+                  <pic:nvPicPr>
+                    <pic:cNvPr id="0" name="Picture 7"/>
+                    <pic:cNvPicPr>
+                      <a:picLocks noChangeAspect="1" noChangeArrowheads="1"/>
+                    </pic:cNvPicPr>
+                  </pic:nvPicPr>
+                  <pic:blipFill>
+                    <a:blip r:embed="rId18">
+                      <a:extLst>
+                        <a:ext uri="{28A0092B-C50C-407E-A947-70E740481C1C}">
+                          <a14:useLocalDpi xmlns:a14="http://schemas.microsoft.com/office/drawing/2010/main" val="0"/>
+                        </a:ext>
+                      </a:extLst>
+                    </a:blip>
+                    <a:srcRect/>
+                    <a:stretch>
+                      <a:fillRect/>
+                    </a:stretch>
+                  </pic:blipFill>
+                  <pic:spPr bwMode="auto">
+                    <a:xfrm>
+                      <a:off x="0" y="0"/>
+                      <a:ext cx="278130" cy="254635"/>
+                    </a:xfrm>
+                    <a:prstGeom prst="rect">
+                      <a:avLst/>
+                    </a:prstGeom>
+                    <a:noFill/>
+                    <a:ln>
+                      <a:noFill/>
+                    </a:ln>
+                  </pic:spPr>
+                </pic:pic>
+              </a:graphicData>
+            </a:graphic>
+          </wp:inline>
+        </w:drawing>
+      </w:r>
+      <w:r>
+        <w:tab/>
+        <w:t>P</w:t>
+      </w:r>
+      <w:r>
+        <w:t>ermet d’afficher le suivi des versions et d’ouvrir la documentation du plugin</w:t>
+      </w:r>
+      <w:r>
+        <w:t>.</w:t>
+      </w:r>
+    </w:p>
+    <w:p>
+      <w:pPr>
+        <w:ind w:left="705" w:hanging="705"/>
+      </w:pPr>
+    </w:p>
+    <w:p>
+      <w:pPr>
+        <w:ind w:left="705" w:hanging="705"/>
+      </w:pPr>
+      <w:r>
+        <w:rPr>
+          <w:noProof/>
+        </w:rPr>
+        <w:drawing>
+          <wp:inline distT="0" distB="0" distL="0" distR="0" wp14:anchorId="7EA590C8" wp14:editId="01A98538">
+            <wp:extent cx="254635" cy="254635"/>
+            <wp:effectExtent l="0" t="0" r="0" b="0"/>
+            <wp:docPr id="19" name="Image 19"/>
+            <wp:cNvGraphicFramePr>
+              <a:graphicFrameLocks xmlns:a="http://schemas.openxmlformats.org/drawingml/2006/main" noChangeAspect="1"/>
+            </wp:cNvGraphicFramePr>
+            <a:graphic xmlns:a="http://schemas.openxmlformats.org/drawingml/2006/main">
+              <a:graphicData uri="http://schemas.openxmlformats.org/drawingml/2006/picture">
+                <pic:pic xmlns:pic="http://schemas.openxmlformats.org/drawingml/2006/picture">
+                  <pic:nvPicPr>
+                    <pic:cNvPr id="0" name="Picture 8"/>
+                    <pic:cNvPicPr>
+                      <a:picLocks noChangeAspect="1" noChangeArrowheads="1"/>
+                    </pic:cNvPicPr>
+                  </pic:nvPicPr>
+                  <pic:blipFill>
+                    <a:blip r:embed="rId19">
+                      <a:extLst>
+                        <a:ext uri="{28A0092B-C50C-407E-A947-70E740481C1C}">
+                          <a14:useLocalDpi xmlns:a14="http://schemas.microsoft.com/office/drawing/2010/main" val="0"/>
+                        </a:ext>
+                      </a:extLst>
+                    </a:blip>
+                    <a:srcRect/>
+                    <a:stretch>
+                      <a:fillRect/>
+                    </a:stretch>
+                  </pic:blipFill>
+                  <pic:spPr bwMode="auto">
+                    <a:xfrm>
+                      <a:off x="0" y="0"/>
+                      <a:ext cx="254635" cy="254635"/>
+                    </a:xfrm>
+                    <a:prstGeom prst="rect">
+                      <a:avLst/>
+                    </a:prstGeom>
+                    <a:noFill/>
+                    <a:ln>
+                      <a:noFill/>
+                    </a:ln>
+                  </pic:spPr>
+                </pic:pic>
+              </a:graphicData>
+            </a:graphic>
+          </wp:inline>
+        </w:drawing>
+      </w:r>
+      <w:r>
+        <w:tab/>
+        <w:t>Permet d’importer une configuration des filtres des champs.</w:t>
+      </w:r>
+    </w:p>
+    <w:p>
+      <w:pPr>
+        <w:ind w:left="705" w:hanging="705"/>
+      </w:pPr>
+      <w:r>
+        <w:rPr>
+          <w:noProof/>
+        </w:rPr>
+        <w:drawing>
+          <wp:inline distT="0" distB="0" distL="0" distR="0" wp14:anchorId="6975FCEE" wp14:editId="79574441">
+            <wp:extent cx="270510" cy="246380"/>
+            <wp:effectExtent l="0" t="0" r="0" b="1270"/>
+            <wp:docPr id="21" name="Image 21"/>
+            <wp:cNvGraphicFramePr>
+              <a:graphicFrameLocks xmlns:a="http://schemas.openxmlformats.org/drawingml/2006/main" noChangeAspect="1"/>
+            </wp:cNvGraphicFramePr>
+            <a:graphic xmlns:a="http://schemas.openxmlformats.org/drawingml/2006/main">
+              <a:graphicData uri="http://schemas.openxmlformats.org/drawingml/2006/picture">
+                <pic:pic xmlns:pic="http://schemas.openxmlformats.org/drawingml/2006/picture">
+                  <pic:nvPicPr>
+                    <pic:cNvPr id="0" name="Picture 9"/>
+                    <pic:cNvPicPr>
+                      <a:picLocks noChangeAspect="1" noChangeArrowheads="1"/>
+                    </pic:cNvPicPr>
+                  </pic:nvPicPr>
+                  <pic:blipFill>
+                    <a:blip r:embed="rId20">
+                      <a:extLst>
+                        <a:ext uri="{28A0092B-C50C-407E-A947-70E740481C1C}">
+                          <a14:useLocalDpi xmlns:a14="http://schemas.microsoft.com/office/drawing/2010/main" val="0"/>
+                        </a:ext>
+                      </a:extLst>
+                    </a:blip>
+                    <a:srcRect/>
+                    <a:stretch>
+                      <a:fillRect/>
+                    </a:stretch>
+                  </pic:blipFill>
+                  <pic:spPr bwMode="auto">
+                    <a:xfrm>
+                      <a:off x="0" y="0"/>
+                      <a:ext cx="270510" cy="246380"/>
+                    </a:xfrm>
+                    <a:prstGeom prst="rect">
+                      <a:avLst/>
+                    </a:prstGeom>
+                    <a:noFill/>
+                    <a:ln>
+                      <a:noFill/>
+                    </a:ln>
+                  </pic:spPr>
+                </pic:pic>
+              </a:graphicData>
+            </a:graphic>
+          </wp:inline>
+        </w:drawing>
+      </w:r>
+      <w:r>
+        <w:tab/>
+        <w:t>Permet d’exporter la configuration des filtres des champs</w:t>
+      </w:r>
+    </w:p>
+    <w:p/>
+    <w:p>
+      <w:r>
+        <w:rPr>
+          <w:noProof/>
+        </w:rPr>
+        <w:drawing>
+          <wp:inline distT="0" distB="0" distL="0" distR="0" wp14:anchorId="2E88FFB5" wp14:editId="2A1290BD">
+            <wp:extent cx="1256306" cy="270510"/>
+            <wp:effectExtent l="0" t="0" r="1270" b="0"/>
+            <wp:docPr id="24" name="Image 24"/>
+            <wp:cNvGraphicFramePr>
+              <a:graphicFrameLocks xmlns:a="http://schemas.openxmlformats.org/drawingml/2006/main" noChangeAspect="1"/>
+            </wp:cNvGraphicFramePr>
+            <a:graphic xmlns:a="http://schemas.openxmlformats.org/drawingml/2006/main">
+              <a:graphicData uri="http://schemas.openxmlformats.org/drawingml/2006/picture">
+                <pic:pic xmlns:pic="http://schemas.openxmlformats.org/drawingml/2006/picture">
+                  <pic:nvPicPr>
+                    <pic:cNvPr id="0" name="Picture 10"/>
+                    <pic:cNvPicPr>
+                      <a:picLocks noChangeAspect="1" noChangeArrowheads="1"/>
+                    </pic:cNvPicPr>
+                  </pic:nvPicPr>
+                  <pic:blipFill>
+                    <a:blip r:embed="rId21">
+                      <a:extLst>
+                        <a:ext uri="{28A0092B-C50C-407E-A947-70E740481C1C}">
+                          <a14:useLocalDpi xmlns:a14="http://schemas.microsoft.com/office/drawing/2010/main" val="0"/>
+                        </a:ext>
+                      </a:extLst>
+                    </a:blip>
+                    <a:srcRect/>
+                    <a:stretch>
+                      <a:fillRect/>
+                    </a:stretch>
+                  </pic:blipFill>
+                  <pic:spPr bwMode="auto">
+                    <a:xfrm>
+                      <a:off x="0" y="0"/>
+                      <a:ext cx="1258832" cy="271054"/>
+                    </a:xfrm>
+                    <a:prstGeom prst="rect">
+                      <a:avLst/>
+                    </a:prstGeom>
+                    <a:noFill/>
+                    <a:ln>
+                      <a:noFill/>
+                    </a:ln>
+                  </pic:spPr>
+                </pic:pic>
+              </a:graphicData>
+            </a:graphic>
+          </wp:inline>
+        </w:drawing>
+      </w:r>
+      <w:r>
+        <w:t xml:space="preserve"> </w:t>
+      </w:r>
+      <w:r>
+        <w:tab/>
+        <w:t>Permet de valider les modifications dans QGIS</w:t>
+      </w:r>
+      <w:r>
+        <w:t xml:space="preserve">. </w:t>
+      </w:r>
+      <w:r>
+        <w:t>Les modifications vers le serveur IGN seront effectives uniquement après avoir enregistré les modifications de la couche via :</w:t>
+      </w:r>
+      <w:r>
+        <w:rPr>
+          <w:noProof/>
+        </w:rPr>
+        <w:drawing>
+          <wp:inline distT="0" distB="0" distL="0" distR="0" wp14:anchorId="2C63C97E" wp14:editId="3D7DE90F">
+            <wp:extent cx="166977" cy="187797"/>
+            <wp:effectExtent l="0" t="0" r="5080" b="3175"/>
+            <wp:docPr id="26" name="Image 26"/>
+            <wp:cNvGraphicFramePr>
+              <a:graphicFrameLocks xmlns:a="http://schemas.openxmlformats.org/drawingml/2006/main" noChangeAspect="1"/>
+            </wp:cNvGraphicFramePr>
+            <a:graphic xmlns:a="http://schemas.openxmlformats.org/drawingml/2006/main">
+              <a:graphicData uri="http://schemas.openxmlformats.org/drawingml/2006/picture">
+                <pic:pic xmlns:pic="http://schemas.openxmlformats.org/drawingml/2006/picture">
+                  <pic:nvPicPr>
+                    <pic:cNvPr id="0" name="Picture 11"/>
+                    <pic:cNvPicPr>
+                      <a:picLocks noChangeAspect="1" noChangeArrowheads="1"/>
+                    </pic:cNvPicPr>
+                  </pic:nvPicPr>
+                  <pic:blipFill>
+                    <a:blip r:embed="rId22">
+                      <a:extLst>
+                        <a:ext uri="{28A0092B-C50C-407E-A947-70E740481C1C}">
+                          <a14:useLocalDpi xmlns:a14="http://schemas.microsoft.com/office/drawing/2010/main" val="0"/>
+                        </a:ext>
+                      </a:extLst>
+                    </a:blip>
+                    <a:srcRect/>
+                    <a:stretch>
+                      <a:fillRect/>
+                    </a:stretch>
+                  </pic:blipFill>
+                  <pic:spPr bwMode="auto">
+                    <a:xfrm>
+                      <a:off x="0" y="0"/>
+                      <a:ext cx="168863" cy="189918"/>
+                    </a:xfrm>
+                    <a:prstGeom prst="rect">
+                      <a:avLst/>
+                    </a:prstGeom>
+                    <a:noFill/>
+                    <a:ln>
+                      <a:noFill/>
+                    </a:ln>
+                  </pic:spPr>
+                </pic:pic>
+              </a:graphicData>
+            </a:graphic>
+          </wp:inline>
+        </w:drawing>
+      </w:r>
+    </w:p>
+    <w:p>
+      <w:pPr>
+        <w:ind w:left="2832"/>
+      </w:pPr>
+    </w:p>
+    <w:p>
+      <w:pPr>
+        <w:rPr>
+          <w:bCs/>
+        </w:rPr>
+      </w:pPr>
+      <w:r>
+        <w:rPr>
+          <w:b/>
+          <w:highlight w:val="red"/>
+        </w:rPr>
+        <w:t>ATTENTION</w:t>
+      </w:r>
+      <w:r>
+        <w:rPr>
+          <w:b/>
+        </w:rPr>
+        <w:t xml:space="preserve"> : </w:t>
+      </w:r>
+      <w:r>
+        <w:rPr>
+          <w:bCs/>
+        </w:rPr>
+        <w:t xml:space="preserve">ne pas confondre avec l’enregistrement du projet : </w:t>
+      </w:r>
+      <w:r>
+        <w:rPr>
+          <w:bCs/>
+          <w:noProof/>
+        </w:rPr>
+        <w:drawing>
+          <wp:inline distT="0" distB="0" distL="0" distR="0" wp14:anchorId="76DFBCEE" wp14:editId="31F95AE8">
+            <wp:extent cx="636104" cy="201454"/>
+            <wp:effectExtent l="0" t="0" r="0" b="8255"/>
+            <wp:docPr id="27" name="Image 27"/>
+            <wp:cNvGraphicFramePr>
+              <a:graphicFrameLocks xmlns:a="http://schemas.openxmlformats.org/drawingml/2006/main" noChangeAspect="1"/>
+            </wp:cNvGraphicFramePr>
+            <a:graphic xmlns:a="http://schemas.openxmlformats.org/drawingml/2006/main">
+              <a:graphicData uri="http://schemas.openxmlformats.org/drawingml/2006/picture">
+                <pic:pic xmlns:pic="http://schemas.openxmlformats.org/drawingml/2006/picture">
+                  <pic:nvPicPr>
+                    <pic:cNvPr id="0" name="Picture 12"/>
+                    <pic:cNvPicPr>
+                      <a:picLocks noChangeAspect="1" noChangeArrowheads="1"/>
+                    </pic:cNvPicPr>
+                  </pic:nvPicPr>
+                  <pic:blipFill>
+                    <a:blip r:embed="rId23">
+                      <a:extLst>
+                        <a:ext uri="{28A0092B-C50C-407E-A947-70E740481C1C}">
+                          <a14:useLocalDpi xmlns:a14="http://schemas.microsoft.com/office/drawing/2010/main" val="0"/>
+                        </a:ext>
+                      </a:extLst>
+                    </a:blip>
+                    <a:srcRect/>
+                    <a:stretch>
+                      <a:fillRect/>
+                    </a:stretch>
+                  </pic:blipFill>
+                  <pic:spPr bwMode="auto">
+                    <a:xfrm>
+                      <a:off x="0" y="0"/>
+                      <a:ext cx="645900" cy="204556"/>
+                    </a:xfrm>
+                    <a:prstGeom prst="rect">
+                      <a:avLst/>
+                    </a:prstGeom>
+                    <a:noFill/>
+                    <a:ln>
+                      <a:noFill/>
+                    </a:ln>
+                  </pic:spPr>
+                </pic:pic>
+              </a:graphicData>
+            </a:graphic>
+          </wp:inline>
+        </w:drawing>
+      </w:r>
+      <w:r>
+        <w:rPr>
+          <w:b/>
+        </w:rPr>
+        <w:t xml:space="preserve"> </w:t>
+      </w:r>
+      <w:r>
+        <w:rPr>
+          <w:bCs/>
+        </w:rPr>
+        <w:br w:type="page"/>
+      </w:r>
+    </w:p>
+    <w:p>
+      <w:pPr>
+        <w:pStyle w:val="Titre1"/>
+      </w:pPr>
+      <w:bookmarkStart w:id="5" w:name="_Toc214450485"/>
+      <w:r>
+        <w:lastRenderedPageBreak/>
+        <w:t>Filtrage des champs</w:t>
+      </w:r>
+      <w:bookmarkEnd w:id="5"/>
+    </w:p>
+    <w:p>
+      <w:r>
+        <w:t>A la première ouverture le plugin n’affiche aucuns widgets, ceux-ci doivent être configurés.</w:t>
+      </w:r>
+    </w:p>
+    <w:p>
+      <w:pPr>
+        <w:pStyle w:val="Paragraphedeliste"/>
+        <w:numPr>
+          <w:ilvl w:val="0"/>
+          <w:numId w:val="6"/>
+        </w:numPr>
+      </w:pPr>
+      <w:r>
+        <w:t>Soit</w:t>
+      </w:r>
+      <w:r>
+        <w:t xml:space="preserve"> initialement avec un fichier de paramétrage fourni, que l’on peut modifier par la suite</w:t>
+      </w:r>
+    </w:p>
+    <w:p>
+      <w:pPr>
+        <w:pStyle w:val="Paragraphedeliste"/>
+        <w:numPr>
+          <w:ilvl w:val="0"/>
+          <w:numId w:val="6"/>
+        </w:numPr>
+      </w:pPr>
+      <w:r>
+        <w:t>Soit en configurant manuellement les champs à modifier.</w:t>
+      </w:r>
+    </w:p>
+    <w:p/>
+    <w:p>
+      <w:r>
+        <w:t xml:space="preserve">Cliquez sur </w:t>
+      </w:r>
+      <w:r>
+        <w:rPr>
+          <w:noProof/>
+        </w:rPr>
+        <w:drawing>
+          <wp:inline distT="0" distB="0" distL="0" distR="0" wp14:anchorId="01FA7CD2" wp14:editId="789E4097">
+            <wp:extent cx="254635" cy="254635"/>
             <wp:effectExtent l="0" t="0" r="0" b="0"/>
             <wp:docPr id="12" name="Image 12"/>
             <wp:cNvGraphicFramePr>
@@ -2394,23 +3229,36 @@
               <a:graphicData uri="http://schemas.openxmlformats.org/drawingml/2006/picture">
                 <pic:pic xmlns:pic="http://schemas.openxmlformats.org/drawingml/2006/picture">
                   <pic:nvPicPr>
-                    <pic:cNvPr id="1" name=""/>
-                    <pic:cNvPicPr/>
+                    <pic:cNvPr id="0" name="Picture 1"/>
+                    <pic:cNvPicPr>
+                      <a:picLocks noChangeAspect="1" noChangeArrowheads="1"/>
+                    </pic:cNvPicPr>
                   </pic:nvPicPr>
                   <pic:blipFill>
-                    <a:blip r:embed="rId13"/>
+                    <a:blip r:embed="rId15">
+                      <a:extLst>
+                        <a:ext uri="{28A0092B-C50C-407E-A947-70E740481C1C}">
+                          <a14:useLocalDpi xmlns:a14="http://schemas.microsoft.com/office/drawing/2010/main" val="0"/>
+                        </a:ext>
+                      </a:extLst>
+                    </a:blip>
+                    <a:srcRect/>
                     <a:stretch>
                       <a:fillRect/>
                     </a:stretch>
                   </pic:blipFill>
-                  <pic:spPr>
+                  <pic:spPr bwMode="auto">
                     <a:xfrm>
                       <a:off x="0" y="0"/>
-                      <a:ext cx="6153150" cy="2838450"/>
+                      <a:ext cx="254635" cy="254635"/>
                     </a:xfrm>
                     <a:prstGeom prst="rect">
                       <a:avLst/>
                     </a:prstGeom>
+                    <a:noFill/>
+                    <a:ln>
+                      <a:noFill/>
+                    </a:ln>
                   </pic:spPr>
                 </pic:pic>
               </a:graphicData>
@@ -2418,84 +3266,21 @@
           </wp:inline>
         </w:drawing>
       </w:r>
-      <w:r>
-        <w:rPr>
-          <w:noProof/>
-        </w:rPr>
-        <w:t xml:space="preserve"> </w:t>
-      </w:r>
-    </w:p>
+    </w:p>
+    <w:p/>
     <w:p>
       <w:pPr>
         <w:jc w:val="center"/>
       </w:pPr>
-    </w:p>
-    <w:p/>
-    <w:p>
-      <w:r>
-        <w:t xml:space="preserve">Cette interface permet </w:t>
-      </w:r>
-      <w:r>
-        <w:t xml:space="preserve">de </w:t>
-      </w:r>
-      <w:r>
-        <w:t>modifier certains attributs des tronçons de routes</w:t>
-      </w:r>
-    </w:p>
-    <w:p/>
-    <w:p>
-      <w:r>
-        <w:t>Le bouton « </w:t>
-      </w:r>
-      <w:r>
-        <w:rPr>
-          <w:b/>
-          <w:bCs/>
-        </w:rPr>
-        <w:t>?</w:t>
-      </w:r>
-      <w:r>
-        <w:t> » permet d’afficher le suivi des versions et d’ouvrir la documentation du plugin</w:t>
-      </w:r>
-      <w:r>
-        <w:t>.</w:t>
-      </w:r>
-    </w:p>
-    <w:p/>
-    <w:p>
-      <w:r>
-        <w:t>Le bouton « </w:t>
-      </w:r>
-      <w:r>
-        <w:rPr>
-          <w:b/>
-          <w:bCs/>
-        </w:rPr>
-        <w:t>Réinitialiser les attributs de la sélection</w:t>
-      </w:r>
-      <w:r>
-        <w:t xml:space="preserve"> » permet </w:t>
-      </w:r>
-      <w:r>
-        <w:t>d’annuler les modifications en cours</w:t>
-      </w:r>
-      <w:r>
-        <w:t>.</w:t>
-      </w:r>
-    </w:p>
-    <w:p>
-      <w:r>
-        <w:t xml:space="preserve">Le bouton </w:t>
-      </w:r>
       <w:r>
         <w:rPr>
           <w:noProof/>
         </w:rPr>
         <w:drawing>
-          <wp:inline distT="0" distB="0" distL="0" distR="0" wp14:anchorId="7070DC5C" wp14:editId="660AF3D0">
-            <wp:extent cx="647700" cy="260142"/>
-            <wp:effectExtent l="0" t="0" r="0" b="6985"/>
-            <wp:docPr id="3" name="Image 3"/>
+          <wp:inline distT="0" distB="0" distL="0" distR="0" wp14:anchorId="467A7E3D" wp14:editId="140AEB26">
+            <wp:extent cx="2874132" cy="3132814"/>
+            <wp:effectExtent l="0" t="0" r="2540" b="0"/>
+            <wp:docPr id="16" name="Image 16"/>
             <wp:cNvGraphicFramePr>
               <a:graphicFrameLocks xmlns:a="http://schemas.openxmlformats.org/drawingml/2006/main" noChangeAspect="1"/>
             </wp:cNvGraphicFramePr>
@@ -2503,29 +3288,36 @@
               <a:graphicData uri="http://schemas.openxmlformats.org/drawingml/2006/picture">
                 <pic:pic xmlns:pic="http://schemas.openxmlformats.org/drawingml/2006/picture">
                   <pic:nvPicPr>
-                    <pic:cNvPr id="3" name="Image 3"/>
-                    <pic:cNvPicPr/>
+                    <pic:cNvPr id="0" name="Picture 3"/>
+                    <pic:cNvPicPr>
+                      <a:picLocks noChangeAspect="1" noChangeArrowheads="1"/>
+                    </pic:cNvPicPr>
                   </pic:nvPicPr>
                   <pic:blipFill>
-                    <a:blip r:embed="rId14">
+                    <a:blip r:embed="rId24">
                       <a:extLst>
                         <a:ext uri="{28A0092B-C50C-407E-A947-70E740481C1C}">
                           <a14:useLocalDpi xmlns:a14="http://schemas.microsoft.com/office/drawing/2010/main" val="0"/>
                         </a:ext>
                       </a:extLst>
                     </a:blip>
+                    <a:srcRect/>
                     <a:stretch>
                       <a:fillRect/>
                     </a:stretch>
                   </pic:blipFill>
-                  <pic:spPr>
+                  <pic:spPr bwMode="auto">
                     <a:xfrm>
                       <a:off x="0" y="0"/>
-                      <a:ext cx="653775" cy="262582"/>
+                      <a:ext cx="2879257" cy="3138401"/>
                     </a:xfrm>
                     <a:prstGeom prst="rect">
                       <a:avLst/>
                     </a:prstGeom>
+                    <a:noFill/>
+                    <a:ln>
+                      <a:noFill/>
+                    </a:ln>
                   </pic:spPr>
                 </pic:pic>
               </a:graphicData>
@@ -2533,23 +3325,138 @@
           </wp:inline>
         </w:drawing>
       </w:r>
-      <w:r>
-        <w:t xml:space="preserve"> Permet de modifier la couleur des tronçons sélectionnés dans QGIS. Ça peut être utile suivant la symbologie appliquées pour les tronçons dans QGIS.</w:t>
-      </w:r>
     </w:p>
     <w:p/>
     <w:p>
       <w:r>
-        <w:t xml:space="preserve">Le bouton </w:t>
-      </w:r>
+        <w:t>Cette interface permet de choisir les champs ainsi que les valeurs qui doivent apparaitre dans l’interface principal pour pouvoir les modifier par la suite.</w:t>
+      </w:r>
+    </w:p>
+    <w:p>
+      <w:r>
+        <w:t>En rouge : les champs ne sont pas modifiables, on peut les ajouter juste pour consultation.</w:t>
+      </w:r>
+    </w:p>
+    <w:p>
+      <w:r>
+        <w:t>Les champs qui ne peuvent pas se « dérouler » correspondent à des widgets « zone de texte »</w:t>
+      </w:r>
+    </w:p>
+    <w:p>
+      <w:r>
+        <w:rPr>
+          <w:color w:val="FF0000"/>
+        </w:rPr>
+        <w:t>Important </w:t>
+      </w:r>
+      <w:r>
+        <w:t>: pour les champs « déroulables </w:t>
+      </w:r>
+      <w:r>
+        <w:t>»,</w:t>
+      </w:r>
+      <w:r>
+        <w:t xml:space="preserve"> ne pas oublier de sélectionner également une ou plusieurs valeurs.</w:t>
+      </w:r>
+    </w:p>
+    <w:p/>
+    <w:p>
+      <w:r>
+        <w:t>On actualise l’interface principal avec le bouton « actualiser la sélection »</w:t>
+      </w:r>
+    </w:p>
+    <w:p/>
+    <w:p>
+      <w:pPr>
+        <w:pStyle w:val="Titre2"/>
+      </w:pPr>
+      <w:bookmarkStart w:id="6" w:name="_Toc214450486"/>
+      <w:r>
+        <w:t>Sélection unique</w:t>
+      </w:r>
+      <w:r>
+        <w:t xml:space="preserve"> / multiple</w:t>
+      </w:r>
+      <w:bookmarkEnd w:id="6"/>
+    </w:p>
+    <w:p>
+      <w:r>
+        <w:t>Lorsque l’on sélectionne une ou plusieurs entités, l’interface met :</w:t>
+      </w:r>
+    </w:p>
+    <w:p>
+      <w:pPr>
+        <w:pStyle w:val="Paragraphedeliste"/>
+        <w:numPr>
+          <w:ilvl w:val="0"/>
+          <w:numId w:val="4"/>
+        </w:numPr>
+      </w:pPr>
+      <w:r>
+        <w:t>E</w:t>
+      </w:r>
+      <w:r>
+        <w:t>n vert</w:t>
+      </w:r>
+      <w:r>
+        <w:t xml:space="preserve"> : </w:t>
+      </w:r>
+      <w:r>
+        <w:t xml:space="preserve">les attributs communs à chaque </w:t>
+      </w:r>
+      <w:r>
+        <w:t>champ</w:t>
+      </w:r>
+      <w:r>
+        <w:t xml:space="preserve"> pour toutes les entités</w:t>
+      </w:r>
+      <w:r>
+        <w:t xml:space="preserve"> sélectionnées.</w:t>
+      </w:r>
+    </w:p>
+    <w:p>
+      <w:pPr>
+        <w:pStyle w:val="Paragraphedeliste"/>
+        <w:numPr>
+          <w:ilvl w:val="0"/>
+          <w:numId w:val="4"/>
+        </w:numPr>
+      </w:pPr>
+      <w:r>
+        <w:t>En grisé : les valeurs en lecture seules</w:t>
+      </w:r>
+    </w:p>
+    <w:p>
+      <w:pPr>
+        <w:pStyle w:val="Paragraphedeliste"/>
+        <w:numPr>
+          <w:ilvl w:val="0"/>
+          <w:numId w:val="4"/>
+        </w:numPr>
+      </w:pPr>
+      <w:r>
+        <w:t>Sans couleur : les valeurs qui ne sont pas communes à toutes les entités sélectionnées</w:t>
+      </w:r>
+    </w:p>
+    <w:p>
+      <w:pPr>
+        <w:pStyle w:val="Paragraphedeliste"/>
+        <w:ind w:left="936"/>
+      </w:pPr>
+    </w:p>
+    <w:p>
+      <w:pPr>
+        <w:ind w:left="576"/>
+        <w:jc w:val="center"/>
+      </w:pPr>
       <w:r>
         <w:rPr>
           <w:noProof/>
         </w:rPr>
         <w:drawing>
-          <wp:inline distT="0" distB="0" distL="0" distR="0" wp14:anchorId="3E6EC294" wp14:editId="3A2B7DB6">
-            <wp:extent cx="1076325" cy="314325"/>
-            <wp:effectExtent l="0" t="0" r="9525" b="9525"/>
+          <wp:inline distT="0" distB="0" distL="0" distR="0" wp14:anchorId="2A360575" wp14:editId="01018EAB">
+            <wp:extent cx="3803206" cy="1431428"/>
+            <wp:effectExtent l="0" t="0" r="6985" b="0"/>
             <wp:docPr id="28" name="Image 28"/>
             <wp:cNvGraphicFramePr>
               <a:graphicFrameLocks xmlns:a="http://schemas.openxmlformats.org/drawingml/2006/main" noChangeAspect="1"/>
@@ -2558,23 +3465,36 @@
               <a:graphicData uri="http://schemas.openxmlformats.org/drawingml/2006/picture">
                 <pic:pic xmlns:pic="http://schemas.openxmlformats.org/drawingml/2006/picture">
                   <pic:nvPicPr>
-                    <pic:cNvPr id="1" name=""/>
-                    <pic:cNvPicPr/>
+                    <pic:cNvPr id="0" name="Picture 4"/>
+                    <pic:cNvPicPr>
+                      <a:picLocks noChangeAspect="1" noChangeArrowheads="1"/>
+                    </pic:cNvPicPr>
                   </pic:nvPicPr>
                   <pic:blipFill>
-                    <a:blip r:embed="rId15"/>
+                    <a:blip r:embed="rId25">
+                      <a:extLst>
+                        <a:ext uri="{28A0092B-C50C-407E-A947-70E740481C1C}">
+                          <a14:useLocalDpi xmlns:a14="http://schemas.microsoft.com/office/drawing/2010/main" val="0"/>
+                        </a:ext>
+                      </a:extLst>
+                    </a:blip>
+                    <a:srcRect/>
                     <a:stretch>
                       <a:fillRect/>
                     </a:stretch>
                   </pic:blipFill>
-                  <pic:spPr>
+                  <pic:spPr bwMode="auto">
                     <a:xfrm>
                       <a:off x="0" y="0"/>
-                      <a:ext cx="1076325" cy="314325"/>
+                      <a:ext cx="3819779" cy="1437666"/>
                     </a:xfrm>
                     <a:prstGeom prst="rect">
                       <a:avLst/>
                     </a:prstGeom>
+                    <a:noFill/>
+                    <a:ln>
+                      <a:noFill/>
+                    </a:ln>
                   </pic:spPr>
                 </pic:pic>
               </a:graphicData>
@@ -2582,24 +3502,38 @@
           </wp:inline>
         </w:drawing>
       </w:r>
-      <w:r>
-        <w:t xml:space="preserve"> permet de visualiser le sens de numérisation des tronçons de route pour faciliter le choix du Sens de circulation.</w:t>
-      </w:r>
-    </w:p>
-    <w:p/>
-    <w:p>
-      <w:r>
-        <w:t xml:space="preserve">Le bouton </w:t>
+    </w:p>
+    <w:p>
+      <w:pPr>
+        <w:ind w:left="576"/>
+      </w:pPr>
+    </w:p>
+    <w:p>
+      <w:pPr>
+        <w:ind w:left="576"/>
+      </w:pPr>
+    </w:p>
+    <w:p>
+      <w:pPr>
+        <w:pStyle w:val="Titre2"/>
+      </w:pPr>
+      <w:bookmarkStart w:id="7" w:name="_Toc214450487"/>
+      <w:r>
+        <w:lastRenderedPageBreak/>
+        <w:t xml:space="preserve">Sélection </w:t>
+      </w:r>
+      <w:r>
+        <w:t xml:space="preserve">via </w:t>
       </w:r>
       <w:r>
         <w:rPr>
           <w:noProof/>
         </w:rPr>
         <w:drawing>
-          <wp:inline distT="0" distB="0" distL="0" distR="0" wp14:anchorId="2AC4F795" wp14:editId="615ADC3A">
-            <wp:extent cx="323850" cy="323850"/>
-            <wp:effectExtent l="0" t="0" r="0" b="0"/>
-            <wp:docPr id="29" name="Image 29"/>
+          <wp:inline distT="0" distB="0" distL="0" distR="0" wp14:anchorId="27144A48" wp14:editId="01457BD6">
+            <wp:extent cx="214685" cy="190178"/>
+            <wp:effectExtent l="0" t="0" r="0" b="635"/>
+            <wp:docPr id="32" name="Image 32"/>
             <wp:cNvGraphicFramePr>
               <a:graphicFrameLocks xmlns:a="http://schemas.openxmlformats.org/drawingml/2006/main" noChangeAspect="1"/>
             </wp:cNvGraphicFramePr>
@@ -2607,23 +3541,36 @@
               <a:graphicData uri="http://schemas.openxmlformats.org/drawingml/2006/picture">
                 <pic:pic xmlns:pic="http://schemas.openxmlformats.org/drawingml/2006/picture">
                   <pic:nvPicPr>
-                    <pic:cNvPr id="1" name=""/>
-                    <pic:cNvPicPr/>
+                    <pic:cNvPr id="0" name="Picture 13"/>
+                    <pic:cNvPicPr>
+                      <a:picLocks noChangeAspect="1" noChangeArrowheads="1"/>
+                    </pic:cNvPicPr>
                   </pic:nvPicPr>
                   <pic:blipFill>
-                    <a:blip r:embed="rId16"/>
+                    <a:blip r:embed="rId12">
+                      <a:extLst>
+                        <a:ext uri="{28A0092B-C50C-407E-A947-70E740481C1C}">
+                          <a14:useLocalDpi xmlns:a14="http://schemas.microsoft.com/office/drawing/2010/main" val="0"/>
+                        </a:ext>
+                      </a:extLst>
+                    </a:blip>
+                    <a:srcRect/>
                     <a:stretch>
                       <a:fillRect/>
                     </a:stretch>
                   </pic:blipFill>
-                  <pic:spPr>
+                  <pic:spPr bwMode="auto">
                     <a:xfrm>
                       <a:off x="0" y="0"/>
-                      <a:ext cx="323850" cy="323850"/>
+                      <a:ext cx="216366" cy="191667"/>
                     </a:xfrm>
                     <a:prstGeom prst="rect">
                       <a:avLst/>
                     </a:prstGeom>
+                    <a:noFill/>
+                    <a:ln>
+                      <a:noFill/>
+                    </a:ln>
                   </pic:spPr>
                 </pic:pic>
               </a:graphicData>
@@ -2631,345 +3578,18 @@
           </wp:inline>
         </w:drawing>
       </w:r>
-      <w:r>
-        <w:t xml:space="preserve"> recentre l’écran sur les tronçons sélectionnés.</w:t>
-      </w:r>
+      <w:bookmarkEnd w:id="7"/>
     </w:p>
     <w:p/>
     <w:p>
-      <w:r>
-        <w:t xml:space="preserve">Le bouton  </w:t>
-      </w:r>
       <w:r>
         <w:rPr>
           <w:noProof/>
         </w:rPr>
         <w:drawing>
-          <wp:inline distT="0" distB="0" distL="0" distR="0" wp14:anchorId="342B8059" wp14:editId="03E7B4BF">
-            <wp:extent cx="333375" cy="333375"/>
-            <wp:effectExtent l="0" t="0" r="9525" b="9525"/>
-            <wp:docPr id="30" name="Image 30"/>
-            <wp:cNvGraphicFramePr>
-              <a:graphicFrameLocks xmlns:a="http://schemas.openxmlformats.org/drawingml/2006/main" noChangeAspect="1"/>
-            </wp:cNvGraphicFramePr>
-            <a:graphic xmlns:a="http://schemas.openxmlformats.org/drawingml/2006/main">
-              <a:graphicData uri="http://schemas.openxmlformats.org/drawingml/2006/picture">
-                <pic:pic xmlns:pic="http://schemas.openxmlformats.org/drawingml/2006/picture">
-                  <pic:nvPicPr>
-                    <pic:cNvPr id="1" name=""/>
-                    <pic:cNvPicPr/>
-                  </pic:nvPicPr>
-                  <pic:blipFill>
-                    <a:blip r:embed="rId17"/>
-                    <a:stretch>
-                      <a:fillRect/>
-                    </a:stretch>
-                  </pic:blipFill>
-                  <pic:spPr>
-                    <a:xfrm>
-                      <a:off x="0" y="0"/>
-                      <a:ext cx="333375" cy="333375"/>
-                    </a:xfrm>
-                    <a:prstGeom prst="rect">
-                      <a:avLst/>
-                    </a:prstGeom>
-                  </pic:spPr>
-                </pic:pic>
-              </a:graphicData>
-            </a:graphic>
-          </wp:inline>
-        </w:drawing>
-      </w:r>
-      <w:r>
-        <w:t xml:space="preserve">   sélectionne tous les tronçons de route entre les 2 tronçons sélectionnés en respectant l’itinéraire le plus court entre les 2.</w:t>
-      </w:r>
-    </w:p>
-    <w:p/>
-    <w:p>
-      <w:pPr>
-        <w:rPr>
-          <w:b/>
-        </w:rPr>
-      </w:pPr>
-      <w:r>
-        <w:t>Le bouton « </w:t>
-      </w:r>
-      <w:r>
-        <w:rPr>
-          <w:b/>
-          <w:bCs/>
-        </w:rPr>
-        <w:t>Valider les modifications</w:t>
-      </w:r>
-      <w:r>
-        <w:t> »</w:t>
-      </w:r>
-      <w:r>
-        <w:t xml:space="preserve"> valide les </w:t>
-      </w:r>
-      <w:r>
-        <w:t>choix et enregistre les modifications dans la</w:t>
-      </w:r>
-      <w:r>
-        <w:t xml:space="preserve"> couche</w:t>
-      </w:r>
-      <w:r>
-        <w:rPr>
-          <w:bCs/>
-        </w:rPr>
-        <w:t>.</w:t>
-      </w:r>
-    </w:p>
-    <w:p>
-      <w:pPr>
-        <w:spacing w:before="0" w:after="200" w:line="276" w:lineRule="auto"/>
-        <w:jc w:val="left"/>
-      </w:pPr>
-    </w:p>
-    <w:p>
-      <w:pPr>
-        <w:spacing w:before="0" w:after="200" w:line="276" w:lineRule="auto"/>
-        <w:jc w:val="left"/>
-      </w:pPr>
-    </w:p>
-    <w:p>
-      <w:pPr>
-        <w:spacing w:before="0" w:after="200" w:line="276" w:lineRule="auto"/>
-        <w:jc w:val="left"/>
-      </w:pPr>
-    </w:p>
-    <w:p>
-      <w:pPr>
-        <w:spacing w:before="0" w:after="200" w:line="276" w:lineRule="auto"/>
-        <w:jc w:val="left"/>
-      </w:pPr>
-    </w:p>
-    <w:p>
-      <w:pPr>
-        <w:spacing w:before="0" w:after="200" w:line="276" w:lineRule="auto"/>
-        <w:jc w:val="left"/>
-      </w:pPr>
-    </w:p>
-    <w:p>
-      <w:pPr>
-        <w:spacing w:before="0" w:after="200" w:line="276" w:lineRule="auto"/>
-        <w:jc w:val="left"/>
-      </w:pPr>
-    </w:p>
-    <w:p>
-      <w:pPr>
-        <w:spacing w:before="0" w:after="200" w:line="276" w:lineRule="auto"/>
-        <w:jc w:val="left"/>
-      </w:pPr>
-    </w:p>
-    <w:p>
-      <w:pPr>
-        <w:pStyle w:val="Titre1"/>
-      </w:pPr>
-      <w:bookmarkStart w:id="5" w:name="_Toc204246306"/>
-      <w:r>
-        <w:t>Mode de sélection</w:t>
-      </w:r>
-      <w:bookmarkEnd w:id="5"/>
-    </w:p>
-    <w:p/>
-    <w:p>
-      <w:pPr>
-        <w:pStyle w:val="Titre2"/>
-      </w:pPr>
-      <w:bookmarkStart w:id="6" w:name="_Toc204246307"/>
-      <w:r>
-        <w:t>Sélection unique</w:t>
-      </w:r>
-      <w:bookmarkEnd w:id="6"/>
-    </w:p>
-    <w:p/>
-    <w:p>
-      <w:pPr>
-        <w:pStyle w:val="Paragraphedeliste"/>
-        <w:numPr>
-          <w:ilvl w:val="0"/>
-          <w:numId w:val="4"/>
-        </w:numPr>
-      </w:pPr>
-      <w:r>
-        <w:t>Sélection unique, on ne sélectionne qu’un seul tronçon avec l’outil de sélection de QGIS</w:t>
-      </w:r>
-    </w:p>
-    <w:p>
-      <w:pPr>
-        <w:pStyle w:val="Paragraphedeliste"/>
-        <w:ind w:left="936"/>
-      </w:pPr>
-    </w:p>
-    <w:p>
-      <w:pPr>
-        <w:ind w:left="576"/>
-      </w:pPr>
-      <w:r>
-        <w:rPr>
-          <w:noProof/>
-        </w:rPr>
-        <w:drawing>
-          <wp:inline distT="0" distB="0" distL="0" distR="0" wp14:anchorId="75A5C995" wp14:editId="015BA899">
-            <wp:extent cx="5153779" cy="2377440"/>
-            <wp:effectExtent l="0" t="0" r="8890" b="3810"/>
-            <wp:docPr id="14" name="Image 14"/>
-            <wp:cNvGraphicFramePr>
-              <a:graphicFrameLocks xmlns:a="http://schemas.openxmlformats.org/drawingml/2006/main" noChangeAspect="1"/>
-            </wp:cNvGraphicFramePr>
-            <a:graphic xmlns:a="http://schemas.openxmlformats.org/drawingml/2006/main">
-              <a:graphicData uri="http://schemas.openxmlformats.org/drawingml/2006/picture">
-                <pic:pic xmlns:pic="http://schemas.openxmlformats.org/drawingml/2006/picture">
-                  <pic:nvPicPr>
-                    <pic:cNvPr id="1" name=""/>
-                    <pic:cNvPicPr/>
-                  </pic:nvPicPr>
-                  <pic:blipFill>
-                    <a:blip r:embed="rId13"/>
-                    <a:stretch>
-                      <a:fillRect/>
-                    </a:stretch>
-                  </pic:blipFill>
-                  <pic:spPr>
-                    <a:xfrm>
-                      <a:off x="0" y="0"/>
-                      <a:ext cx="5162122" cy="2381289"/>
-                    </a:xfrm>
-                    <a:prstGeom prst="rect">
-                      <a:avLst/>
-                    </a:prstGeom>
-                  </pic:spPr>
-                </pic:pic>
-              </a:graphicData>
-            </a:graphic>
-          </wp:inline>
-        </w:drawing>
-      </w:r>
-      <w:r>
-        <w:rPr>
-          <w:noProof/>
-        </w:rPr>
-        <w:t xml:space="preserve"> </w:t>
-      </w:r>
-    </w:p>
-    <w:p>
-      <w:pPr>
-        <w:ind w:left="576"/>
-      </w:pPr>
-    </w:p>
-    <w:p>
-      <w:pPr>
-        <w:ind w:left="576"/>
-      </w:pPr>
-      <w:r>
-        <w:t>Les</w:t>
-      </w:r>
-      <w:r>
-        <w:t xml:space="preserve"> </w:t>
-      </w:r>
-      <w:r>
-        <w:t xml:space="preserve">valeurs des </w:t>
-      </w:r>
-      <w:r>
-        <w:t>attributs du tronçon sélectionné s’affiche</w:t>
-      </w:r>
-      <w:r>
-        <w:t>nt</w:t>
-      </w:r>
-      <w:r>
-        <w:t xml:space="preserve"> en vert dans l’interface.</w:t>
-      </w:r>
-    </w:p>
-    <w:p>
-      <w:pPr>
-        <w:ind w:left="576"/>
-      </w:pPr>
-    </w:p>
-    <w:p>
-      <w:pPr>
-        <w:pStyle w:val="Titre2"/>
-      </w:pPr>
-      <w:bookmarkStart w:id="7" w:name="_Toc204246308"/>
-      <w:r>
-        <w:t>Sélection multiple</w:t>
-      </w:r>
-      <w:bookmarkEnd w:id="7"/>
-    </w:p>
-    <w:p/>
-    <w:p>
-      <w:pPr>
-        <w:pStyle w:val="Paragraphedeliste"/>
-        <w:numPr>
-          <w:ilvl w:val="0"/>
-          <w:numId w:val="4"/>
-        </w:numPr>
-      </w:pPr>
-      <w:r>
-        <w:t>Sélection multiple avec l’outil de saisi</w:t>
-      </w:r>
-      <w:r>
-        <w:t>e</w:t>
-      </w:r>
-      <w:r>
-        <w:t>. Dans QGIS on peut sélectionner manuellement un ensemble de tronçons</w:t>
-      </w:r>
-    </w:p>
-    <w:p>
-      <w:pPr>
-        <w:pStyle w:val="Paragraphedeliste"/>
-        <w:ind w:left="936"/>
-      </w:pPr>
-    </w:p>
-    <w:p>
-      <w:pPr>
-        <w:pStyle w:val="Paragraphedeliste"/>
-        <w:numPr>
-          <w:ilvl w:val="0"/>
-          <w:numId w:val="4"/>
-        </w:numPr>
-      </w:pPr>
-      <w:r>
-        <w:t xml:space="preserve"> </w:t>
-      </w:r>
-      <w:r>
-        <w:t>Sélection multiple de tronçons contigües, on sélectionne 2</w:t>
-      </w:r>
-      <w:r>
-        <w:t xml:space="preserve"> tronçons</w:t>
-      </w:r>
-      <w:r>
-        <w:t xml:space="preserve"> (le premier et le dernier).</w:t>
-      </w:r>
-      <w:r>
-        <w:t xml:space="preserve"> </w:t>
-      </w:r>
-      <w:r>
-        <w:t>Ces 2 tronçons doivent être visible</w:t>
-      </w:r>
-      <w:r>
-        <w:t>s</w:t>
-      </w:r>
-      <w:r>
-        <w:t xml:space="preserve"> à l’écran et être connectés.</w:t>
-      </w:r>
-      <w:r>
-        <w:t xml:space="preserve"> Ensuite </w:t>
-      </w:r>
-      <w:r>
-        <w:t>o</w:t>
-      </w:r>
-      <w:r>
-        <w:t xml:space="preserve">n clique sur </w:t>
-      </w:r>
-      <w:r>
-        <w:rPr>
-          <w:noProof/>
-        </w:rPr>
-        <w:drawing>
-          <wp:inline distT="0" distB="0" distL="0" distR="0" wp14:anchorId="6464AAF9" wp14:editId="05001164">
-            <wp:extent cx="333375" cy="333375"/>
-            <wp:effectExtent l="0" t="0" r="9525" b="9525"/>
+          <wp:inline distT="0" distB="0" distL="0" distR="0" wp14:anchorId="5C725637" wp14:editId="296271B2">
+            <wp:extent cx="230588" cy="230588"/>
+            <wp:effectExtent l="0" t="0" r="0" b="0"/>
             <wp:docPr id="31" name="Image 31"/>
             <wp:cNvGraphicFramePr>
               <a:graphicFrameLocks xmlns:a="http://schemas.openxmlformats.org/drawingml/2006/main" noChangeAspect="1"/>
@@ -2982,7 +3602,7 @@
                     <pic:cNvPicPr/>
                   </pic:nvPicPr>
                   <pic:blipFill>
-                    <a:blip r:embed="rId17"/>
+                    <a:blip r:embed="rId26"/>
                     <a:stretch>
                       <a:fillRect/>
                     </a:stretch>
@@ -2990,7 +3610,7 @@
                   <pic:spPr>
                     <a:xfrm>
                       <a:off x="0" y="0"/>
-                      <a:ext cx="333375" cy="333375"/>
+                      <a:ext cx="232374" cy="232374"/>
                     </a:xfrm>
                     <a:prstGeom prst="rect">
                       <a:avLst/>
@@ -3003,107 +3623,74 @@
         </w:drawing>
       </w:r>
       <w:r>
-        <w:t>, le résultat est une sélection de tous les tronçons entre le premier et le deuxième sélectionné</w:t>
+        <w:t xml:space="preserve"> Ce bouton </w:t>
+      </w:r>
+      <w:r>
+        <w:t xml:space="preserve">permet </w:t>
+      </w:r>
+      <w:r>
+        <w:t xml:space="preserve">la sélection de toutes </w:t>
+      </w:r>
+      <w:r>
+        <w:t>les entités comprises</w:t>
+      </w:r>
+      <w:r>
+        <w:t xml:space="preserve"> entre 2</w:t>
+      </w:r>
+      <w:r>
+        <w:t xml:space="preserve"> linéaires</w:t>
+      </w:r>
+      <w:r>
+        <w:t xml:space="preserve"> sélection</w:t>
+      </w:r>
+      <w:r>
+        <w:t>nés</w:t>
+      </w:r>
+      <w:r>
+        <w:t>.</w:t>
+      </w:r>
+    </w:p>
+    <w:p>
+      <w:r>
+        <w:t>Il faut</w:t>
+      </w:r>
+      <w:r>
+        <w:t xml:space="preserve"> sélectionne</w:t>
+      </w:r>
+      <w:r>
+        <w:t>r</w:t>
+      </w:r>
+      <w:r>
+        <w:t xml:space="preserve"> 2</w:t>
+      </w:r>
+      <w:r>
+        <w:t xml:space="preserve"> tronçons</w:t>
+      </w:r>
+      <w:r>
+        <w:t>.</w:t>
+      </w:r>
+      <w:r>
+        <w:t xml:space="preserve"> </w:t>
+      </w:r>
+      <w:r>
+        <w:t>Ces 2 tronçons doivent être visible</w:t>
       </w:r>
       <w:r>
         <w:t>s</w:t>
       </w:r>
       <w:r>
-        <w:t xml:space="preserve"> respectant l’algorithme du chemin le plus court. Un contrôle visuel est toutefois nécessaire afin de vérifier si </w:t>
-      </w:r>
-      <w:r>
-        <w:t>la sélection faite est celle attendue.</w:t>
-      </w:r>
-    </w:p>
-    <w:p>
-      <w:pPr>
-        <w:pStyle w:val="Paragraphedeliste"/>
-      </w:pPr>
-    </w:p>
-    <w:p>
-      <w:pPr>
-        <w:pStyle w:val="Paragraphedeliste"/>
-        <w:ind w:left="936"/>
-      </w:pPr>
-    </w:p>
-    <w:p>
-      <w:pPr>
-        <w:pStyle w:val="Paragraphedeliste"/>
-        <w:ind w:left="936"/>
-      </w:pPr>
-      <w:r>
-        <w:rPr>
-          <w:noProof/>
-        </w:rPr>
-        <mc:AlternateContent>
-          <mc:Choice Requires="wps">
-            <w:drawing>
-              <wp:anchor distT="0" distB="0" distL="114300" distR="114300" simplePos="0" relativeHeight="251661312" behindDoc="0" locked="0" layoutInCell="1" allowOverlap="1" wp14:anchorId="5DA807B9" wp14:editId="0AE37E85">
-                <wp:simplePos x="0" y="0"/>
-                <wp:positionH relativeFrom="column">
-                  <wp:posOffset>1491211</wp:posOffset>
-                </wp:positionH>
-                <wp:positionV relativeFrom="paragraph">
-                  <wp:posOffset>1628775</wp:posOffset>
-                </wp:positionV>
-                <wp:extent cx="524656" cy="472190"/>
-                <wp:effectExtent l="0" t="0" r="27940" b="23495"/>
-                <wp:wrapNone/>
-                <wp:docPr id="20" name="Ellipse 20"/>
-                <wp:cNvGraphicFramePr/>
-                <a:graphic xmlns:a="http://schemas.openxmlformats.org/drawingml/2006/main">
-                  <a:graphicData uri="http://schemas.microsoft.com/office/word/2010/wordprocessingShape">
-                    <wps:wsp>
-                      <wps:cNvSpPr/>
-                      <wps:spPr>
-                        <a:xfrm>
-                          <a:off x="0" y="0"/>
-                          <a:ext cx="524656" cy="472190"/>
-                        </a:xfrm>
-                        <a:prstGeom prst="ellipse">
-                          <a:avLst/>
-                        </a:prstGeom>
-                        <a:noFill/>
-                      </wps:spPr>
-                      <wps:style>
-                        <a:lnRef idx="2">
-                          <a:schemeClr val="accent2">
-                            <a:shade val="50000"/>
-                          </a:schemeClr>
-                        </a:lnRef>
-                        <a:fillRef idx="1">
-                          <a:schemeClr val="accent2"/>
-                        </a:fillRef>
-                        <a:effectRef idx="0">
-                          <a:schemeClr val="accent2"/>
-                        </a:effectRef>
-                        <a:fontRef idx="minor">
-                          <a:schemeClr val="lt1"/>
-                        </a:fontRef>
-                      </wps:style>
-                      <wps:bodyPr rot="0" spcFirstLastPara="0" vertOverflow="overflow" horzOverflow="overflow" vert="horz" wrap="square" lIns="91440" tIns="45720" rIns="91440" bIns="45720" numCol="1" spcCol="0" rtlCol="0" fromWordArt="0" anchor="ctr" anchorCtr="0" forceAA="0" compatLnSpc="1">
-                        <a:prstTxWarp prst="textNoShape">
-                          <a:avLst/>
-                        </a:prstTxWarp>
-                        <a:noAutofit/>
-                      </wps:bodyPr>
-                    </wps:wsp>
-                  </a:graphicData>
-                </a:graphic>
-              </wp:anchor>
-            </w:drawing>
-          </mc:Choice>
-          <mc:Fallback>
-            <w:pict>
-              <v:oval w14:anchorId="5B0DEFAD" id="Ellipse 20" o:spid="_x0000_s1026" style="position:absolute;margin-left:117.4pt;margin-top:128.25pt;width:41.3pt;height:37.2pt;z-index:251661312;visibility:visible;mso-wrap-style:square;mso-wrap-distance-left:9pt;mso-wrap-distance-top:0;mso-wrap-distance-right:9pt;mso-wrap-distance-bottom:0;mso-position-horizontal:absolute;mso-position-horizontal-relative:text;mso-position-vertical:absolute;mso-position-vertical-relative:text;v-text-anchor:middle" o:gfxdata="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" filled="f" strokecolor="#622423 [1605]" strokeweight="2pt"/>
-            </w:pict>
-          </mc:Fallback>
-        </mc:AlternateContent>
-      </w:r>
-      <w:r>
-        <w:rPr>
-          <w:noProof/>
-        </w:rPr>
+        <w:t xml:space="preserve"> à l’écran et être connectés.</w:t>
+      </w:r>
+      <w:r>
+        <w:t xml:space="preserve"> Ensuite </w:t>
+      </w:r>
+      <w:r>
+        <w:t>o</w:t>
+      </w:r>
+      <w:r>
+        <w:t>n clique sur</w:t>
+      </w:r>
+      <w:r>
         <w:t xml:space="preserve"> </w:t>
       </w:r>
       <w:r>
@@ -3111,10 +3698,10 @@
           <w:noProof/>
         </w:rPr>
         <w:drawing>
-          <wp:inline distT="0" distB="0" distL="0" distR="0" wp14:anchorId="731137B1" wp14:editId="699B7F48">
-            <wp:extent cx="4688378" cy="2162750"/>
-            <wp:effectExtent l="0" t="0" r="0" b="9525"/>
-            <wp:docPr id="1" name="Image 1"/>
+          <wp:inline distT="0" distB="0" distL="0" distR="0" wp14:anchorId="59FDE8D6" wp14:editId="24AD5645">
+            <wp:extent cx="166977" cy="147916"/>
+            <wp:effectExtent l="0" t="0" r="5080" b="5080"/>
+            <wp:docPr id="29" name="Image 29"/>
             <wp:cNvGraphicFramePr>
               <a:graphicFrameLocks xmlns:a="http://schemas.openxmlformats.org/drawingml/2006/main" noChangeAspect="1"/>
             </wp:cNvGraphicFramePr>
@@ -3122,23 +3709,36 @@
               <a:graphicData uri="http://schemas.openxmlformats.org/drawingml/2006/picture">
                 <pic:pic xmlns:pic="http://schemas.openxmlformats.org/drawingml/2006/picture">
                   <pic:nvPicPr>
-                    <pic:cNvPr id="1" name=""/>
-                    <pic:cNvPicPr/>
+                    <pic:cNvPr id="0" name="Picture 5"/>
+                    <pic:cNvPicPr>
+                      <a:picLocks noChangeAspect="1" noChangeArrowheads="1"/>
+                    </pic:cNvPicPr>
                   </pic:nvPicPr>
                   <pic:blipFill>
-                    <a:blip r:embed="rId18"/>
+                    <a:blip r:embed="rId12">
+                      <a:extLst>
+                        <a:ext uri="{28A0092B-C50C-407E-A947-70E740481C1C}">
+                          <a14:useLocalDpi xmlns:a14="http://schemas.microsoft.com/office/drawing/2010/main" val="0"/>
+                        </a:ext>
+                      </a:extLst>
+                    </a:blip>
+                    <a:srcRect/>
                     <a:stretch>
                       <a:fillRect/>
                     </a:stretch>
                   </pic:blipFill>
-                  <pic:spPr>
+                  <pic:spPr bwMode="auto">
                     <a:xfrm>
                       <a:off x="0" y="0"/>
-                      <a:ext cx="4738968" cy="2186087"/>
+                      <a:ext cx="169131" cy="149824"/>
                     </a:xfrm>
                     <a:prstGeom prst="rect">
                       <a:avLst/>
                     </a:prstGeom>
+                    <a:noFill/>
+                    <a:ln>
+                      <a:noFill/>
+                    </a:ln>
                   </pic:spPr>
                 </pic:pic>
               </a:graphicData>
@@ -3147,37 +3747,18 @@
         </w:drawing>
       </w:r>
       <w:r>
-        <w:rPr>
-          <w:noProof/>
-        </w:rPr>
-        <w:t xml:space="preserve"> </w:t>
-      </w:r>
-    </w:p>
-    <w:p>
-      <w:pPr>
-        <w:pStyle w:val="Paragraphedeliste"/>
-        <w:ind w:left="936"/>
-      </w:pPr>
-    </w:p>
-    <w:p>
-      <w:pPr>
-        <w:pStyle w:val="Paragraphedeliste"/>
-        <w:ind w:left="936"/>
-      </w:pPr>
-      <w:r>
-        <w:t>Seuls les attributs communs</w:t>
-      </w:r>
-      <w:r>
-        <w:t xml:space="preserve"> à tous les tronçons sont représentés en vert.</w:t>
-      </w:r>
-    </w:p>
-    <w:p>
-      <w:pPr>
-        <w:pStyle w:val="Paragraphedeliste"/>
-        <w:ind w:left="936"/>
-      </w:pPr>
-    </w:p>
-    <w:p/>
+        <w:t>, le résultat est une sélection de tous les tronçons entre le premier et le deuxième sélectionné</w:t>
+      </w:r>
+      <w:r>
+        <w:t>s</w:t>
+      </w:r>
+      <w:r>
+        <w:t xml:space="preserve"> respectant l’algorithme du chemin le plus court. Un contrôle visuel est toutefois nécessaire afin de vérifier si </w:t>
+      </w:r>
+      <w:r>
+        <w:t>la sélection faite est celle attendue.</w:t>
+      </w:r>
+    </w:p>
     <w:p/>
     <w:p>
       <w:pPr>
@@ -3189,7 +3770,7 @@
       <w:bookmarkStart w:id="11" w:name="_Toc223756091"/>
       <w:bookmarkStart w:id="12" w:name="_Toc223425647"/>
       <w:bookmarkStart w:id="13" w:name="_Toc223756092"/>
-      <w:bookmarkStart w:id="14" w:name="_Toc204246309"/>
+      <w:bookmarkStart w:id="14" w:name="_Toc214450488"/>
       <w:bookmarkStart w:id="15" w:name="_Toc215049623"/>
       <w:bookmarkEnd w:id="8"/>
       <w:bookmarkEnd w:id="9"/>
@@ -3200,6 +3781,9 @@
       <w:r>
         <w:t>Modification</w:t>
       </w:r>
+      <w:r>
+        <w:t xml:space="preserve"> des valeurs des champs</w:t>
+      </w:r>
       <w:bookmarkEnd w:id="14"/>
     </w:p>
     <w:p>
@@ -3220,15 +3804,18 @@
     </w:p>
     <w:p/>
     <w:p>
+      <w:pPr>
+        <w:jc w:val="center"/>
+      </w:pPr>
       <w:r>
         <w:rPr>
           <w:noProof/>
         </w:rPr>
         <w:drawing>
-          <wp:inline distT="0" distB="0" distL="0" distR="0" wp14:anchorId="1A76A2E0" wp14:editId="0CEBFECF">
-            <wp:extent cx="5544589" cy="2557721"/>
-            <wp:effectExtent l="0" t="0" r="0" b="0"/>
-            <wp:docPr id="4" name="Image 4"/>
+          <wp:inline distT="0" distB="0" distL="0" distR="0" wp14:anchorId="05C2BEA3" wp14:editId="2E9EAE36">
+            <wp:extent cx="3745064" cy="1409545"/>
+            <wp:effectExtent l="0" t="0" r="8255" b="635"/>
+            <wp:docPr id="35" name="Image 35"/>
             <wp:cNvGraphicFramePr>
               <a:graphicFrameLocks xmlns:a="http://schemas.openxmlformats.org/drawingml/2006/main" noChangeAspect="1"/>
             </wp:cNvGraphicFramePr>
@@ -3236,23 +3823,36 @@
               <a:graphicData uri="http://schemas.openxmlformats.org/drawingml/2006/picture">
                 <pic:pic xmlns:pic="http://schemas.openxmlformats.org/drawingml/2006/picture">
                   <pic:nvPicPr>
-                    <pic:cNvPr id="1" name=""/>
-                    <pic:cNvPicPr/>
+                    <pic:cNvPr id="0" name="Picture 8"/>
+                    <pic:cNvPicPr>
+                      <a:picLocks noChangeAspect="1" noChangeArrowheads="1"/>
+                    </pic:cNvPicPr>
                   </pic:nvPicPr>
                   <pic:blipFill>
-                    <a:blip r:embed="rId19"/>
+                    <a:blip r:embed="rId27">
+                      <a:extLst>
+                        <a:ext uri="{28A0092B-C50C-407E-A947-70E740481C1C}">
+                          <a14:useLocalDpi xmlns:a14="http://schemas.microsoft.com/office/drawing/2010/main" val="0"/>
+                        </a:ext>
+                      </a:extLst>
+                    </a:blip>
+                    <a:srcRect/>
                     <a:stretch>
                       <a:fillRect/>
                     </a:stretch>
                   </pic:blipFill>
-                  <pic:spPr>
+                  <pic:spPr bwMode="auto">
                     <a:xfrm>
                       <a:off x="0" y="0"/>
-                      <a:ext cx="5553329" cy="2561753"/>
+                      <a:ext cx="3760262" cy="1415265"/>
                     </a:xfrm>
                     <a:prstGeom prst="rect">
                       <a:avLst/>
                     </a:prstGeom>
+                    <a:noFill/>
+                    <a:ln>
+                      <a:noFill/>
+                    </a:ln>
                   </pic:spPr>
                 </pic:pic>
               </a:graphicData>
@@ -3264,15 +3864,16 @@
     <w:p/>
     <w:p>
       <w:r>
-        <w:t>Les valeurs non autorisées apparaissent en grisé et ne sont pas sélectionnables.</w:t>
-      </w:r>
-    </w:p>
-    <w:p>
-      <w:r>
-        <w:t>Les valeurs modifiées sont affichées sur un fond rose</w:t>
-      </w:r>
-      <w:r>
-        <w:t xml:space="preserve"> mais ne sont pas encore validées</w:t>
+        <w:t xml:space="preserve">Les valeurs </w:t>
+      </w:r>
+      <w:r>
+        <w:t>en lecture seules</w:t>
+      </w:r>
+      <w:r>
+        <w:t xml:space="preserve"> apparaissent en grisé et ne sont pas </w:t>
+      </w:r>
+      <w:r>
+        <w:t>modifiables</w:t>
       </w:r>
       <w:r>
         <w:t>.</w:t>
@@ -3280,10 +3881,95 @@
     </w:p>
     <w:p>
       <w:r>
-        <w:t>Si on modifie la nature, l’outil propose des valeurs compatibles avec la nouvelle nature pour les autres attributs.</w:t>
+        <w:t>Les valeurs</w:t>
+      </w:r>
+      <w:r>
+        <w:t xml:space="preserve"> à</w:t>
+      </w:r>
+      <w:r>
+        <w:t xml:space="preserve"> modifi</w:t>
+      </w:r>
+      <w:r>
+        <w:t>er</w:t>
+      </w:r>
+      <w:r>
+        <w:t xml:space="preserve"> sont affichées sur un fond </w:t>
+      </w:r>
+      <w:r>
+        <w:t>bleu (par défaut)</w:t>
+      </w:r>
+      <w:r>
+        <w:t>.</w:t>
       </w:r>
     </w:p>
     <w:p/>
+    <w:p>
+      <w:r>
+        <w:t xml:space="preserve">Les modifications </w:t>
+      </w:r>
+      <w:r>
+        <w:t xml:space="preserve">sur le(s) tronçon(s) sélectionné(s) </w:t>
+      </w:r>
+      <w:r>
+        <w:t xml:space="preserve">sont à valider avec le </w:t>
+      </w:r>
+      <w:r>
+        <w:t xml:space="preserve">bouton </w:t>
+      </w:r>
+      <w:r>
+        <w:rPr>
+          <w:noProof/>
+        </w:rPr>
+        <w:drawing>
+          <wp:inline distT="0" distB="0" distL="0" distR="0" wp14:anchorId="1B61B3AB" wp14:editId="35EBF1FA">
+            <wp:extent cx="1106861" cy="206899"/>
+            <wp:effectExtent l="0" t="0" r="0" b="3175"/>
+            <wp:docPr id="36" name="Image 36"/>
+            <wp:cNvGraphicFramePr>
+              <a:graphicFrameLocks xmlns:a="http://schemas.openxmlformats.org/drawingml/2006/main" noChangeAspect="1"/>
+            </wp:cNvGraphicFramePr>
+            <a:graphic xmlns:a="http://schemas.openxmlformats.org/drawingml/2006/main">
+              <a:graphicData uri="http://schemas.openxmlformats.org/drawingml/2006/picture">
+                <pic:pic xmlns:pic="http://schemas.openxmlformats.org/drawingml/2006/picture">
+                  <pic:nvPicPr>
+                    <pic:cNvPr id="0" name="Picture 9"/>
+                    <pic:cNvPicPr>
+                      <a:picLocks noChangeAspect="1" noChangeArrowheads="1"/>
+                    </pic:cNvPicPr>
+                  </pic:nvPicPr>
+                  <pic:blipFill>
+                    <a:blip r:embed="rId21">
+                      <a:extLst>
+                        <a:ext uri="{28A0092B-C50C-407E-A947-70E740481C1C}">
+                          <a14:useLocalDpi xmlns:a14="http://schemas.microsoft.com/office/drawing/2010/main" val="0"/>
+                        </a:ext>
+                      </a:extLst>
+                    </a:blip>
+                    <a:srcRect/>
+                    <a:stretch>
+                      <a:fillRect/>
+                    </a:stretch>
+                  </pic:blipFill>
+                  <pic:spPr bwMode="auto">
+                    <a:xfrm>
+                      <a:off x="0" y="0"/>
+                      <a:ext cx="1119942" cy="209344"/>
+                    </a:xfrm>
+                    <a:prstGeom prst="rect">
+                      <a:avLst/>
+                    </a:prstGeom>
+                    <a:noFill/>
+                    <a:ln>
+                      <a:noFill/>
+                    </a:ln>
+                  </pic:spPr>
+                </pic:pic>
+              </a:graphicData>
+            </a:graphic>
+          </wp:inline>
+        </w:drawing>
+      </w:r>
+    </w:p>
     <w:p>
       <w:r>
         <w:rPr>
@@ -3292,16 +3978,16 @@
         <mc:AlternateContent>
           <mc:Choice Requires="wps">
             <w:drawing>
-              <wp:anchor distT="91440" distB="91440" distL="137160" distR="137160" simplePos="0" relativeHeight="251664384" behindDoc="0" locked="0" layoutInCell="0" allowOverlap="1" wp14:anchorId="707960A0" wp14:editId="15864B84">
+              <wp:anchor distT="91440" distB="91440" distL="137160" distR="137160" simplePos="0" relativeHeight="251664384" behindDoc="0" locked="0" layoutInCell="0" allowOverlap="1" wp14:anchorId="707960A0" wp14:editId="169715A9">
                 <wp:simplePos x="0" y="0"/>
                 <wp:positionH relativeFrom="margin">
-                  <wp:posOffset>2003425</wp:posOffset>
+                  <wp:posOffset>1418590</wp:posOffset>
                 </wp:positionH>
                 <wp:positionV relativeFrom="margin">
-                  <wp:posOffset>4190365</wp:posOffset>
+                  <wp:posOffset>4668520</wp:posOffset>
                 </wp:positionV>
-                <wp:extent cx="1149985" cy="4547870"/>
-                <wp:effectExtent l="0" t="3492" r="8572" b="8573"/>
+                <wp:extent cx="1256665" cy="3481070"/>
+                <wp:effectExtent l="0" t="7302" r="0" b="0"/>
                 <wp:wrapSquare wrapText="bothSides"/>
                 <wp:docPr id="306" name="Forme automatique 2"/>
                 <wp:cNvGraphicFramePr>
@@ -3316,7 +4002,7 @@
                       <wps:spPr bwMode="auto">
                         <a:xfrm rot="5400000">
                           <a:off x="0" y="0"/>
-                          <a:ext cx="1149985" cy="4547870"/>
+                          <a:ext cx="1256665" cy="3481070"/>
                         </a:xfrm>
                         <a:prstGeom prst="roundRect">
                           <a:avLst>
@@ -3330,6 +4016,9 @@
                       <wps:txbx>
                         <w:txbxContent>
                           <w:p>
+                            <w:pPr>
+                              <w:jc w:val="center"/>
+                            </w:pPr>
                             <w:r>
                               <w:t>Attention : seule la base client est modifiée. Pour envoyer les modifications sur le serveur BDUni il faut le faire par l’intermédiaire du plugin espace collaboratif IGN, en cliquant sur l’enregistrement de la couche </w:t>
                             </w:r>
@@ -3357,9 +4046,9 @@
                                 <w:noProof/>
                               </w:rPr>
                               <w:drawing>
-                                <wp:inline distT="0" distB="0" distL="0" distR="0" wp14:anchorId="45C9342B" wp14:editId="52E31ED3">
-                                  <wp:extent cx="1152525" cy="409575"/>
-                                  <wp:effectExtent l="0" t="0" r="9525" b="9525"/>
+                                <wp:inline distT="0" distB="0" distL="0" distR="0" wp14:anchorId="45C9342B" wp14:editId="7B9685EF">
+                                  <wp:extent cx="818984" cy="291044"/>
+                                  <wp:effectExtent l="0" t="0" r="635" b="0"/>
                                   <wp:docPr id="25" name="Image 25"/>
                                   <wp:cNvGraphicFramePr>
                                     <a:graphicFrameLocks xmlns:a="http://schemas.openxmlformats.org/drawingml/2006/main" noChangeAspect="1"/>
@@ -3372,7 +4061,7 @@
                                           <pic:cNvPicPr/>
                                         </pic:nvPicPr>
                                         <pic:blipFill>
-                                          <a:blip r:embed="rId20"/>
+                                          <a:blip r:embed="rId28"/>
                                           <a:stretch>
                                             <a:fillRect/>
                                           </a:stretch>
@@ -3380,7 +4069,7 @@
                                         <pic:spPr>
                                           <a:xfrm>
                                             <a:off x="0" y="0"/>
-                                            <a:ext cx="1152525" cy="409575"/>
+                                            <a:ext cx="832780" cy="295947"/>
                                           </a:xfrm>
                                           <a:prstGeom prst="rect">
                                             <a:avLst/>
@@ -3391,17 +4080,6 @@
                                   </a:graphic>
                                 </wp:inline>
                               </w:drawing>
-                            </w:r>
-                            <w:r>
-                              <w:rPr>
-                                <w:rFonts w:asciiTheme="majorHAnsi" w:eastAsiaTheme="majorEastAsia" w:hAnsiTheme="majorHAnsi" w:cstheme="majorBidi"/>
-                                <w:i/>
-                                <w:iCs/>
-                                <w:color w:val="FFFFFF" w:themeColor="background1"/>
-                                <w:sz w:val="28"/>
-                                <w:szCs w:val="28"/>
-                              </w:rPr>
-                              <w:t xml:space="preserve"> </w:t>
                             </w:r>
                           </w:p>
                         </w:txbxContent>
@@ -3423,19 +4101,27 @@
           </mc:Choice>
           <mc:Fallback>
             <w:pict>
-              <v:roundrect w14:anchorId="707960A0" id="Forme automatique 2" o:spid="_x0000_s1026" style="position:absolute;left:0;text-align:left;margin-left:157.75pt;margin-top:329.95pt;width:90.55pt;height:358.1pt;rotation:90;z-index:251664384;visibility:visible;mso-wrap-style:square;mso-width-percent:0;mso-height-percent:0;mso-wrap-distance-left:10.8pt;mso-wrap-distance-top:7.2pt;mso-wrap-distance-right:10.8pt;mso-wrap-distance-bottom:7.2pt;mso-position-horizontal:absolute;mso-position-horizontal-relative:margin;mso-position-vertical:absolute;mso-position-vertical-relative:margin;mso-width-percent:0;mso-height-percent:0;mso-width-relative:margin;mso-height-relative:margin;v-text-anchor:middle" arcsize="8541f" o:gfxdata="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" o:allowincell="f" fillcolor="#da4232" stroked="f">
+              <v:roundrect w14:anchorId="707960A0" id="Forme automatique 2" o:spid="_x0000_s1026" style="position:absolute;left:0;text-align:left;margin-left:111.7pt;margin-top:367.6pt;width:98.95pt;height:274.1pt;rotation:90;z-index:251664384;visibility:visible;mso-wrap-style:square;mso-width-percent:0;mso-height-percent:0;mso-wrap-distance-left:10.8pt;mso-wrap-distance-top:7.2pt;mso-wrap-distance-right:10.8pt;mso-wrap-distance-bottom:7.2pt;mso-position-horizontal:absolute;mso-position-horizontal-relative:margin;mso-position-vertical:absolute;mso-position-vertical-relative:margin;mso-width-percent:0;mso-height-percent:0;mso-width-relative:margin;mso-height-relative:margin;v-text-anchor:middle" arcsize="8541f" o:gfxdata="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" o:allowincell="f" fillcolor="#da4232" stroked="f">
                 <v:textbox>
                   <w:txbxContent>
                     <w:p>
+                      <w:pPr>
+                        <w:jc w:val="center"/>
+                      </w:pPr>
                       <w:r>
                         <w:t>Attention : seule la base client est modifiée. Pour envoyer les modifications sur le serveur BDUni il faut le faire par l’intermédiaire du plugin espace collaboratif IGN, en cliquant sur l’enregistrement de la couche </w:t>
                       </w:r>
                       <w:r>
-                        <w:t>(disquette)</w:t>
+                        <w:t>(disquette</w:t>
+                      </w:r>
+                      <w:proofErr w:type="gramStart"/>
+                      <w:r>
+                        <w:t>)</w:t>
                       </w:r>
                       <w:r>
                         <w:t>:</w:t>
                       </w:r>
+                      <w:proofErr w:type="gramEnd"/>
                     </w:p>
                     <w:p>
                       <w:pPr>
@@ -3454,9 +4140,9 @@
                           <w:noProof/>
                         </w:rPr>
                         <w:drawing>
-                          <wp:inline distT="0" distB="0" distL="0" distR="0" wp14:anchorId="45C9342B" wp14:editId="52E31ED3">
-                            <wp:extent cx="1152525" cy="409575"/>
-                            <wp:effectExtent l="0" t="0" r="9525" b="9525"/>
+                          <wp:inline distT="0" distB="0" distL="0" distR="0" wp14:anchorId="45C9342B" wp14:editId="7B9685EF">
+                            <wp:extent cx="818984" cy="291044"/>
+                            <wp:effectExtent l="0" t="0" r="635" b="0"/>
                             <wp:docPr id="25" name="Image 25"/>
                             <wp:cNvGraphicFramePr>
                               <a:graphicFrameLocks xmlns:a="http://schemas.openxmlformats.org/drawingml/2006/main" noChangeAspect="1"/>
@@ -3469,7 +4155,7 @@
                                     <pic:cNvPicPr/>
                                   </pic:nvPicPr>
                                   <pic:blipFill>
-                                    <a:blip r:embed="rId21"/>
+                                    <a:blip r:embed="rId29"/>
                                     <a:stretch>
                                       <a:fillRect/>
                                     </a:stretch>
@@ -3477,7 +4163,7 @@
                                   <pic:spPr>
                                     <a:xfrm>
                                       <a:off x="0" y="0"/>
-                                      <a:ext cx="1152525" cy="409575"/>
+                                      <a:ext cx="832780" cy="295947"/>
                                     </a:xfrm>
                                     <a:prstGeom prst="rect">
                                       <a:avLst/>
@@ -3489,17 +4175,6 @@
                           </wp:inline>
                         </w:drawing>
                       </w:r>
-                      <w:r>
-                        <w:rPr>
-                          <w:rFonts w:asciiTheme="majorHAnsi" w:eastAsiaTheme="majorEastAsia" w:hAnsiTheme="majorHAnsi" w:cstheme="majorBidi"/>
-                          <w:i/>
-                          <w:iCs/>
-                          <w:color w:val="FFFFFF" w:themeColor="background1"/>
-                          <w:sz w:val="28"/>
-                          <w:szCs w:val="28"/>
-                        </w:rPr>
-                        <w:t xml:space="preserve"> </w:t>
-                      </w:r>
                     </w:p>
                   </w:txbxContent>
                 </v:textbox>
@@ -3509,60 +4184,6 @@
           </mc:Fallback>
         </mc:AlternateContent>
       </w:r>
-      <w:r>
-        <w:t xml:space="preserve">Les modifications </w:t>
-      </w:r>
-      <w:r>
-        <w:t xml:space="preserve">sur le(s) tronçon(s) sélectionné(s) </w:t>
-      </w:r>
-      <w:r>
-        <w:t xml:space="preserve">sont à valider avec le </w:t>
-      </w:r>
-      <w:r>
-        <w:t xml:space="preserve">bouton </w:t>
-      </w:r>
-      <w:r>
-        <w:rPr>
-          <w:noProof/>
-        </w:rPr>
-        <w:drawing>
-          <wp:inline distT="0" distB="0" distL="0" distR="0" wp14:anchorId="2CBA515B" wp14:editId="02CFDD3D">
-            <wp:extent cx="1628775" cy="295275"/>
-            <wp:effectExtent l="0" t="0" r="9525" b="9525"/>
-            <wp:docPr id="22" name="Image 22"/>
-            <wp:cNvGraphicFramePr>
-              <a:graphicFrameLocks xmlns:a="http://schemas.openxmlformats.org/drawingml/2006/main" noChangeAspect="1"/>
-            </wp:cNvGraphicFramePr>
-            <a:graphic xmlns:a="http://schemas.openxmlformats.org/drawingml/2006/main">
-              <a:graphicData uri="http://schemas.openxmlformats.org/drawingml/2006/picture">
-                <pic:pic xmlns:pic="http://schemas.openxmlformats.org/drawingml/2006/picture">
-                  <pic:nvPicPr>
-                    <pic:cNvPr id="1" name=""/>
-                    <pic:cNvPicPr/>
-                  </pic:nvPicPr>
-                  <pic:blipFill>
-                    <a:blip r:embed="rId22"/>
-                    <a:stretch>
-                      <a:fillRect/>
-                    </a:stretch>
-                  </pic:blipFill>
-                  <pic:spPr>
-                    <a:xfrm>
-                      <a:off x="0" y="0"/>
-                      <a:ext cx="1628775" cy="295275"/>
-                    </a:xfrm>
-                    <a:prstGeom prst="rect">
-                      <a:avLst/>
-                    </a:prstGeom>
-                  </pic:spPr>
-                </pic:pic>
-              </a:graphicData>
-            </a:graphic>
-          </wp:inline>
-        </w:drawing>
-      </w:r>
-    </w:p>
-    <w:p>
       <w:r>
         <w:t>Un message QGIS confirme la prise en compte des modifications.</w:t>
       </w:r>
@@ -3588,7 +4209,7 @@
                     <pic:cNvPicPr/>
                   </pic:nvPicPr>
                   <pic:blipFill>
-                    <a:blip r:embed="rId23"/>
+                    <a:blip r:embed="rId30"/>
                     <a:stretch>
                       <a:fillRect/>
                     </a:stretch>
@@ -3625,24 +4246,159 @@
     <w:p/>
     <w:p/>
     <w:p/>
+    <w:p>
+      <w:r>
+        <w:br w:type="page"/>
+      </w:r>
+    </w:p>
+    <w:p/>
+    <w:p>
+      <w:pPr>
+        <w:pStyle w:val="Titre1"/>
+      </w:pPr>
+      <w:bookmarkStart w:id="16" w:name="_Toc214450489"/>
+      <w:r>
+        <w:t>Modification de l’ordre d’affichage des « widgets »</w:t>
+      </w:r>
+      <w:bookmarkEnd w:id="16"/>
+    </w:p>
+    <w:p/>
+    <w:p>
+      <w:r>
+        <w:t>Apres filtrage des champs-valeurs il peut être pertinent de modifier l’ordre d’affichage des différents « widgets » dans l’interface principale.</w:t>
+      </w:r>
+    </w:p>
+    <w:p>
+      <w:r>
+        <w:t>Cela permet de gérer l’affichage des « widgets » en fonction des plus utilisées.</w:t>
+      </w:r>
+    </w:p>
+    <w:p/>
+    <w:p>
+      <w:r>
+        <w:t xml:space="preserve">Exemple : </w:t>
+      </w:r>
+    </w:p>
+    <w:p>
+      <w:r>
+        <w:t>Par défaut les « widgets » sont insérés par ordre d’affichage dans le filtre.</w:t>
+      </w:r>
+    </w:p>
+    <w:p>
+      <w:r>
+        <w:t>On peut se retrouver avec un widget qui sera souvent utilisé mais qui sera inséré dans la « </w:t>
+      </w:r>
+      <w:proofErr w:type="spellStart"/>
+      <w:r>
+        <w:t>combobox</w:t>
+      </w:r>
+      <w:proofErr w:type="spellEnd"/>
+      <w:r>
+        <w:t> » ou dans un bouton mais pas à la position voulue.</w:t>
+      </w:r>
+    </w:p>
+    <w:p/>
+    <w:p>
+      <w:r>
+        <w:t xml:space="preserve">Solution : </w:t>
+      </w:r>
+    </w:p>
+    <w:p>
+      <w:r>
+        <w:t>Faire un clic-droit sur un « bouton » ou sur une valeur dans le « </w:t>
+      </w:r>
+      <w:proofErr w:type="spellStart"/>
+      <w:r>
+        <w:t>combobox</w:t>
+      </w:r>
+      <w:proofErr w:type="spellEnd"/>
+      <w:r>
+        <w:t xml:space="preserve"> » </w:t>
+      </w:r>
+    </w:p>
+    <w:p/>
+    <w:p>
+      <w:pPr>
+        <w:jc w:val="center"/>
+      </w:pPr>
+      <w:r>
+        <w:rPr>
+          <w:noProof/>
+        </w:rPr>
+        <w:drawing>
+          <wp:inline distT="0" distB="0" distL="0" distR="0" wp14:anchorId="690871AE" wp14:editId="10A26ED6">
+            <wp:extent cx="1621902" cy="810951"/>
+            <wp:effectExtent l="0" t="0" r="0" b="8255"/>
+            <wp:docPr id="42" name="Image 42"/>
+            <wp:cNvGraphicFramePr>
+              <a:graphicFrameLocks xmlns:a="http://schemas.openxmlformats.org/drawingml/2006/main" noChangeAspect="1"/>
+            </wp:cNvGraphicFramePr>
+            <a:graphic xmlns:a="http://schemas.openxmlformats.org/drawingml/2006/main">
+              <a:graphicData uri="http://schemas.openxmlformats.org/drawingml/2006/picture">
+                <pic:pic xmlns:pic="http://schemas.openxmlformats.org/drawingml/2006/picture">
+                  <pic:nvPicPr>
+                    <pic:cNvPr id="0" name="Picture 15"/>
+                    <pic:cNvPicPr>
+                      <a:picLocks noChangeAspect="1" noChangeArrowheads="1"/>
+                    </pic:cNvPicPr>
+                  </pic:nvPicPr>
+                  <pic:blipFill>
+                    <a:blip r:embed="rId31">
+                      <a:extLst>
+                        <a:ext uri="{28A0092B-C50C-407E-A947-70E740481C1C}">
+                          <a14:useLocalDpi xmlns:a14="http://schemas.microsoft.com/office/drawing/2010/main" val="0"/>
+                        </a:ext>
+                      </a:extLst>
+                    </a:blip>
+                    <a:srcRect/>
+                    <a:stretch>
+                      <a:fillRect/>
+                    </a:stretch>
+                  </pic:blipFill>
+                  <pic:spPr bwMode="auto">
+                    <a:xfrm>
+                      <a:off x="0" y="0"/>
+                      <a:ext cx="1625966" cy="812983"/>
+                    </a:xfrm>
+                    <a:prstGeom prst="rect">
+                      <a:avLst/>
+                    </a:prstGeom>
+                    <a:noFill/>
+                    <a:ln>
+                      <a:noFill/>
+                    </a:ln>
+                  </pic:spPr>
+                </pic:pic>
+              </a:graphicData>
+            </a:graphic>
+          </wp:inline>
+        </w:drawing>
+      </w:r>
+    </w:p>
+    <w:p>
+      <w:r>
+        <w:t>Renseigner la nouvelle position.</w:t>
+      </w:r>
+    </w:p>
+    <w:p>
+      <w:r>
+        <w:t>L’interface est mise à jour avec la nouvelle position du « widget ».</w:t>
+      </w:r>
+    </w:p>
     <w:p/>
     <w:p/>
     <w:p/>
     <w:p/>
     <w:p/>
-    <w:p/>
-    <w:p/>
-    <w:p/>
     <w:p>
       <w:pPr>
         <w:pStyle w:val="Titre1"/>
       </w:pPr>
-      <w:bookmarkStart w:id="16" w:name="_Toc204246310"/>
-      <w:r>
-        <w:lastRenderedPageBreak/>
-        <w:t>Extra</w:t>
-      </w:r>
-      <w:bookmarkEnd w:id="16"/>
+      <w:bookmarkStart w:id="17" w:name="_Toc214450490"/>
+      <w:r>
+        <w:t>Paramétrage des préférences de l’interface</w:t>
+      </w:r>
+      <w:bookmarkEnd w:id="17"/>
     </w:p>
     <w:bookmarkEnd w:id="15"/>
     <w:p>
@@ -3653,21 +4409,201 @@
     </w:p>
     <w:p>
       <w:pPr>
+        <w:spacing w:before="0" w:after="200" w:line="276" w:lineRule="auto"/>
+        <w:jc w:val="left"/>
+      </w:pPr>
+      <w:r>
+        <w:rPr>
+          <w:noProof/>
+        </w:rPr>
+        <w:drawing>
+          <wp:inline distT="0" distB="0" distL="0" distR="0" wp14:anchorId="2B99AF34" wp14:editId="5E77EBCD">
+            <wp:extent cx="238760" cy="246380"/>
+            <wp:effectExtent l="0" t="0" r="8890" b="1270"/>
+            <wp:docPr id="39" name="Image 39"/>
+            <wp:cNvGraphicFramePr>
+              <a:graphicFrameLocks xmlns:a="http://schemas.openxmlformats.org/drawingml/2006/main" noChangeAspect="1"/>
+            </wp:cNvGraphicFramePr>
+            <a:graphic xmlns:a="http://schemas.openxmlformats.org/drawingml/2006/main">
+              <a:graphicData uri="http://schemas.openxmlformats.org/drawingml/2006/picture">
+                <pic:pic xmlns:pic="http://schemas.openxmlformats.org/drawingml/2006/picture">
+                  <pic:nvPicPr>
+                    <pic:cNvPr id="0" name="Picture 12"/>
+                    <pic:cNvPicPr>
+                      <a:picLocks noChangeAspect="1" noChangeArrowheads="1"/>
+                    </pic:cNvPicPr>
+                  </pic:nvPicPr>
+                  <pic:blipFill>
+                    <a:blip r:embed="rId16">
+                      <a:extLst>
+                        <a:ext uri="{28A0092B-C50C-407E-A947-70E740481C1C}">
+                          <a14:useLocalDpi xmlns:a14="http://schemas.microsoft.com/office/drawing/2010/main" val="0"/>
+                        </a:ext>
+                      </a:extLst>
+                    </a:blip>
+                    <a:srcRect/>
+                    <a:stretch>
+                      <a:fillRect/>
+                    </a:stretch>
+                  </pic:blipFill>
+                  <pic:spPr bwMode="auto">
+                    <a:xfrm>
+                      <a:off x="0" y="0"/>
+                      <a:ext cx="238760" cy="246380"/>
+                    </a:xfrm>
+                    <a:prstGeom prst="rect">
+                      <a:avLst/>
+                    </a:prstGeom>
+                    <a:noFill/>
+                    <a:ln>
+                      <a:noFill/>
+                    </a:ln>
+                  </pic:spPr>
+                </pic:pic>
+              </a:graphicData>
+            </a:graphic>
+          </wp:inline>
+        </w:drawing>
+      </w:r>
+      <w:r>
+        <w:tab/>
+        <w:t>Ouvre l’interface de paramétrage.</w:t>
+      </w:r>
+    </w:p>
+    <w:p>
+      <w:pPr>
+        <w:spacing w:before="0" w:after="200" w:line="276" w:lineRule="auto"/>
+        <w:jc w:val="center"/>
+      </w:pPr>
+      <w:r>
+        <w:rPr>
+          <w:noProof/>
+        </w:rPr>
+        <w:drawing>
+          <wp:inline distT="0" distB="0" distL="0" distR="0" wp14:anchorId="36301C4E" wp14:editId="362CAF99">
+            <wp:extent cx="2532014" cy="1272263"/>
+            <wp:effectExtent l="0" t="0" r="1905" b="4445"/>
+            <wp:docPr id="41" name="Image 41"/>
+            <wp:cNvGraphicFramePr>
+              <a:graphicFrameLocks xmlns:a="http://schemas.openxmlformats.org/drawingml/2006/main" noChangeAspect="1"/>
+            </wp:cNvGraphicFramePr>
+            <a:graphic xmlns:a="http://schemas.openxmlformats.org/drawingml/2006/main">
+              <a:graphicData uri="http://schemas.openxmlformats.org/drawingml/2006/picture">
+                <pic:pic xmlns:pic="http://schemas.openxmlformats.org/drawingml/2006/picture">
+                  <pic:nvPicPr>
+                    <pic:cNvPr id="0" name="Picture 14"/>
+                    <pic:cNvPicPr>
+                      <a:picLocks noChangeAspect="1" noChangeArrowheads="1"/>
+                    </pic:cNvPicPr>
+                  </pic:nvPicPr>
+                  <pic:blipFill>
+                    <a:blip r:embed="rId32">
+                      <a:extLst>
+                        <a:ext uri="{28A0092B-C50C-407E-A947-70E740481C1C}">
+                          <a14:useLocalDpi xmlns:a14="http://schemas.microsoft.com/office/drawing/2010/main" val="0"/>
+                        </a:ext>
+                      </a:extLst>
+                    </a:blip>
+                    <a:srcRect/>
+                    <a:stretch>
+                      <a:fillRect/>
+                    </a:stretch>
+                  </pic:blipFill>
+                  <pic:spPr bwMode="auto">
+                    <a:xfrm>
+                      <a:off x="0" y="0"/>
+                      <a:ext cx="2537638" cy="1275089"/>
+                    </a:xfrm>
+                    <a:prstGeom prst="rect">
+                      <a:avLst/>
+                    </a:prstGeom>
+                    <a:noFill/>
+                    <a:ln>
+                      <a:noFill/>
+                    </a:ln>
+                  </pic:spPr>
+                </pic:pic>
+              </a:graphicData>
+            </a:graphic>
+          </wp:inline>
+        </w:drawing>
+      </w:r>
+    </w:p>
+    <w:p>
+      <w:pPr>
+        <w:pStyle w:val="Paragraphedeliste"/>
+        <w:numPr>
+          <w:ilvl w:val="0"/>
+          <w:numId w:val="6"/>
+        </w:numPr>
+        <w:spacing w:before="0" w:after="200" w:line="276" w:lineRule="auto"/>
+      </w:pPr>
+      <w:r>
+        <w:t>Cette interface permet de configurer le nombre de « widgets » par ligne</w:t>
+      </w:r>
+    </w:p>
+    <w:p>
+      <w:pPr>
+        <w:spacing w:before="0" w:after="200" w:line="276" w:lineRule="auto"/>
+      </w:pPr>
+      <w:r>
+        <w:t xml:space="preserve">Exemple : ici nous avons 3 « widgets » par ligne, cela signifie que si on </w:t>
+      </w:r>
+      <w:r>
+        <w:t>a sélectionné 5 valeurs différentes pour un champ (dans le filtrage</w:t>
+      </w:r>
+      <w:r>
+        <w:t>),</w:t>
+      </w:r>
+      <w:r>
+        <w:t xml:space="preserve"> dans l’interface principale nous auront les 3 premières valeurs sous forme de « boutons » et les suivantes seront incluses dans une « </w:t>
+      </w:r>
+      <w:proofErr w:type="spellStart"/>
+      <w:r>
+        <w:t>combobox</w:t>
+      </w:r>
+      <w:proofErr w:type="spellEnd"/>
+      <w:r>
+        <w:t> » déroulante.</w:t>
+      </w:r>
+    </w:p>
+    <w:p>
+      <w:pPr>
+        <w:pStyle w:val="Paragraphedeliste"/>
+        <w:numPr>
+          <w:ilvl w:val="0"/>
+          <w:numId w:val="6"/>
+        </w:numPr>
+        <w:spacing w:before="0" w:after="200" w:line="276" w:lineRule="auto"/>
+      </w:pPr>
+      <w:r>
+        <w:t>On peut également modifier les couleurs des différents « widgets »</w:t>
+      </w:r>
+    </w:p>
+    <w:p>
+      <w:pPr>
         <w:spacing w:line="276" w:lineRule="auto"/>
       </w:pPr>
-    </w:p>
-    <w:p>
-      <w:pPr>
-        <w:pStyle w:val="Titre2"/>
-        <w:ind w:firstLine="576"/>
-      </w:pPr>
-      <w:bookmarkStart w:id="17" w:name="_Toc182399295"/>
-      <w:bookmarkStart w:id="18" w:name="_Toc204246311"/>
+      <w:r>
+        <w:br w:type="page"/>
+      </w:r>
+    </w:p>
+    <w:p>
+      <w:pPr>
+        <w:spacing w:line="276" w:lineRule="auto"/>
+      </w:pPr>
+    </w:p>
+    <w:p>
+      <w:pPr>
+        <w:pStyle w:val="Titre1"/>
+      </w:pPr>
+      <w:bookmarkStart w:id="18" w:name="_Toc182399295"/>
+      <w:bookmarkStart w:id="19" w:name="_Toc214450491"/>
       <w:r>
         <w:t>A propos</w:t>
       </w:r>
-      <w:bookmarkEnd w:id="17"/>
       <w:bookmarkEnd w:id="18"/>
+      <w:bookmarkEnd w:id="19"/>
     </w:p>
     <w:p>
       <w:pPr>
@@ -3701,7 +4637,7 @@
                     <pic:cNvPicPr/>
                   </pic:nvPicPr>
                   <pic:blipFill>
-                    <a:blip r:embed="rId24">
+                    <a:blip r:embed="rId33">
                       <a:extLst>
                         <a:ext uri="{28A0092B-C50C-407E-A947-70E740481C1C}">
                           <a14:useLocalDpi xmlns:a14="http://schemas.microsoft.com/office/drawing/2010/main" val="0"/>
@@ -3739,16 +4675,17 @@
     <w:p>
       <w:pPr>
         <w:ind w:firstLine="576"/>
+        <w:jc w:val="center"/>
       </w:pPr>
       <w:r>
         <w:rPr>
           <w:noProof/>
         </w:rPr>
         <w:drawing>
-          <wp:inline distT="0" distB="0" distL="0" distR="0" wp14:anchorId="0662FE3F" wp14:editId="56DFC1E7">
-            <wp:extent cx="5734850" cy="4915586"/>
-            <wp:effectExtent l="0" t="0" r="0" b="0"/>
-            <wp:docPr id="10" name="Image 10"/>
+          <wp:inline distT="0" distB="0" distL="0" distR="0" wp14:anchorId="37D110D7" wp14:editId="1333A737">
+            <wp:extent cx="3265845" cy="2242102"/>
+            <wp:effectExtent l="0" t="0" r="0" b="6350"/>
+            <wp:docPr id="37" name="Image 37"/>
             <wp:cNvGraphicFramePr>
               <a:graphicFrameLocks xmlns:a="http://schemas.openxmlformats.org/drawingml/2006/main" noChangeAspect="1"/>
             </wp:cNvGraphicFramePr>
@@ -3756,29 +4693,36 @@
               <a:graphicData uri="http://schemas.openxmlformats.org/drawingml/2006/picture">
                 <pic:pic xmlns:pic="http://schemas.openxmlformats.org/drawingml/2006/picture">
                   <pic:nvPicPr>
-                    <pic:cNvPr id="10" name="Image 10"/>
-                    <pic:cNvPicPr/>
+                    <pic:cNvPr id="0" name="Picture 10"/>
+                    <pic:cNvPicPr>
+                      <a:picLocks noChangeAspect="1" noChangeArrowheads="1"/>
+                    </pic:cNvPicPr>
                   </pic:nvPicPr>
                   <pic:blipFill>
-                    <a:blip r:embed="rId25">
+                    <a:blip r:embed="rId34">
                       <a:extLst>
                         <a:ext uri="{28A0092B-C50C-407E-A947-70E740481C1C}">
                           <a14:useLocalDpi xmlns:a14="http://schemas.microsoft.com/office/drawing/2010/main" val="0"/>
                         </a:ext>
                       </a:extLst>
                     </a:blip>
+                    <a:srcRect/>
                     <a:stretch>
                       <a:fillRect/>
                     </a:stretch>
                   </pic:blipFill>
-                  <pic:spPr>
+                  <pic:spPr bwMode="auto">
                     <a:xfrm>
                       <a:off x="0" y="0"/>
-                      <a:ext cx="5734850" cy="4915586"/>
+                      <a:ext cx="3273743" cy="2247524"/>
                     </a:xfrm>
                     <a:prstGeom prst="rect">
                       <a:avLst/>
                     </a:prstGeom>
+                    <a:noFill/>
+                    <a:ln>
+                      <a:noFill/>
+                    </a:ln>
                   </pic:spPr>
                 </pic:pic>
               </a:graphicData>
@@ -3799,97 +4743,20 @@
     </w:p>
     <w:p>
       <w:r>
-        <w:t>Cette boite permet de suivre l’</w:t>
-      </w:r>
-      <w:r>
-        <w:t>historique</w:t>
-      </w:r>
-      <w:r>
-        <w:t xml:space="preserve"> des différentes versions ainsi que d’afficher cette documentation.</w:t>
-      </w:r>
-    </w:p>
-    <w:p>
-      <w:pPr>
-        <w:ind w:firstLine="576"/>
-      </w:pPr>
-    </w:p>
-    <w:p>
-      <w:pPr>
-        <w:ind w:firstLine="576"/>
-      </w:pPr>
-    </w:p>
-    <w:p>
-      <w:pPr>
-        <w:ind w:firstLine="576"/>
-      </w:pPr>
-    </w:p>
-    <w:p/>
-    <w:p/>
-    <w:p/>
-    <w:p/>
-    <w:p/>
-    <w:p/>
-    <w:p/>
-    <w:p/>
-    <w:p/>
-    <w:p/>
-    <w:p/>
-    <w:p/>
-    <w:p/>
-    <w:p>
-      <w:pPr>
-        <w:pStyle w:val="Titre1"/>
-      </w:pPr>
-      <w:bookmarkStart w:id="19" w:name="_Toc204246312"/>
-      <w:r>
-        <w:t>Annexes</w:t>
-      </w:r>
-      <w:bookmarkEnd w:id="19"/>
-    </w:p>
-    <w:p/>
-    <w:p>
-      <w:pPr>
-        <w:pStyle w:val="Titre2"/>
-      </w:pPr>
-      <w:bookmarkStart w:id="20" w:name="_Toc204246313"/>
-      <w:r>
-        <w:t xml:space="preserve">Installation du package </w:t>
-      </w:r>
-      <w:proofErr w:type="spellStart"/>
-      <w:r>
-        <w:t>openyxl</w:t>
-      </w:r>
-      <w:bookmarkEnd w:id="20"/>
-      <w:proofErr w:type="spellEnd"/>
-    </w:p>
-    <w:p/>
-    <w:p>
-      <w:bookmarkStart w:id="21" w:name="_Hlk183424311"/>
-      <w:r>
-        <w:t>Ouvrir l’invite de commande, se placer dans le répertoire « bin » de l’installation de QGIS :</w:t>
-      </w:r>
-    </w:p>
-    <w:p>
-      <w:r>
-        <w:t xml:space="preserve">Exemple : </w:t>
-      </w:r>
-    </w:p>
-    <w:bookmarkEnd w:id="21"/>
-    <w:p>
-      <w:pPr>
-        <w:jc w:val="center"/>
-      </w:pPr>
-    </w:p>
-    <w:p>
+        <w:t>Ce</w:t>
+      </w:r>
+      <w:r>
+        <w:t xml:space="preserve"> dialogue </w:t>
+      </w:r>
       <w:r>
         <w:rPr>
           <w:noProof/>
         </w:rPr>
         <w:drawing>
-          <wp:inline distT="0" distB="0" distL="0" distR="0" wp14:anchorId="464A2EEC" wp14:editId="26F6E2EF">
-            <wp:extent cx="5268060" cy="1581371"/>
-            <wp:effectExtent l="0" t="0" r="0" b="0"/>
-            <wp:docPr id="9" name="Image 9"/>
+          <wp:inline distT="0" distB="0" distL="0" distR="0" wp14:anchorId="48501F0D" wp14:editId="142D5C08">
+            <wp:extent cx="238760" cy="246380"/>
+            <wp:effectExtent l="0" t="0" r="8890" b="1270"/>
+            <wp:docPr id="38" name="Image 38"/>
             <wp:cNvGraphicFramePr>
               <a:graphicFrameLocks xmlns:a="http://schemas.openxmlformats.org/drawingml/2006/main" noChangeAspect="1"/>
             </wp:cNvGraphicFramePr>
@@ -3897,29 +4764,36 @@
               <a:graphicData uri="http://schemas.openxmlformats.org/drawingml/2006/picture">
                 <pic:pic xmlns:pic="http://schemas.openxmlformats.org/drawingml/2006/picture">
                   <pic:nvPicPr>
-                    <pic:cNvPr id="9" name="Image 9"/>
-                    <pic:cNvPicPr/>
+                    <pic:cNvPr id="0" name="Picture 11"/>
+                    <pic:cNvPicPr>
+                      <a:picLocks noChangeAspect="1" noChangeArrowheads="1"/>
+                    </pic:cNvPicPr>
                   </pic:nvPicPr>
                   <pic:blipFill>
-                    <a:blip r:embed="rId26">
+                    <a:blip r:embed="rId16">
                       <a:extLst>
                         <a:ext uri="{28A0092B-C50C-407E-A947-70E740481C1C}">
                           <a14:useLocalDpi xmlns:a14="http://schemas.microsoft.com/office/drawing/2010/main" val="0"/>
                         </a:ext>
                       </a:extLst>
                     </a:blip>
+                    <a:srcRect/>
                     <a:stretch>
                       <a:fillRect/>
                     </a:stretch>
                   </pic:blipFill>
-                  <pic:spPr>
+                  <pic:spPr bwMode="auto">
                     <a:xfrm>
                       <a:off x="0" y="0"/>
-                      <a:ext cx="5268060" cy="1581371"/>
+                      <a:ext cx="238760" cy="246380"/>
                     </a:xfrm>
                     <a:prstGeom prst="rect">
                       <a:avLst/>
                     </a:prstGeom>
+                    <a:noFill/>
+                    <a:ln>
+                      <a:noFill/>
+                    </a:ln>
                   </pic:spPr>
                 </pic:pic>
               </a:graphicData>
@@ -3927,107 +4801,19 @@
           </wp:inline>
         </w:drawing>
       </w:r>
-    </w:p>
-    <w:p/>
-    <w:p>
-      <w:bookmarkStart w:id="22" w:name="_Hlk183424337"/>
-      <w:r>
-        <w:t xml:space="preserve">Puis taper la commande : </w:t>
-      </w:r>
-      <w:r>
-        <w:t>python-qgis-ltr.bat</w:t>
-      </w:r>
-      <w:r>
-        <w:t xml:space="preserve"> -m </w:t>
-      </w:r>
-      <w:proofErr w:type="spellStart"/>
-      <w:r>
-        <w:t>pip</w:t>
-      </w:r>
-      <w:proofErr w:type="spellEnd"/>
-      <w:r>
-        <w:t xml:space="preserve"> </w:t>
-      </w:r>
-      <w:proofErr w:type="spellStart"/>
-      <w:r>
-        <w:t>install</w:t>
-      </w:r>
-      <w:proofErr w:type="spellEnd"/>
-      <w:r>
-        <w:t xml:space="preserve"> </w:t>
-      </w:r>
-      <w:proofErr w:type="spellStart"/>
-      <w:r>
-        <w:t>openpyxl</w:t>
-      </w:r>
-      <w:proofErr w:type="spellEnd"/>
-    </w:p>
-    <w:bookmarkEnd w:id="22"/>
-    <w:p/>
-    <w:p>
-      <w:pPr>
-        <w:jc w:val="center"/>
-      </w:pPr>
-      <w:r>
-        <w:rPr>
-          <w:noProof/>
-        </w:rPr>
-        <w:drawing>
-          <wp:inline distT="0" distB="0" distL="0" distR="0" wp14:anchorId="686CC470" wp14:editId="2FB8DFD2">
-            <wp:extent cx="6253480" cy="1409065"/>
-            <wp:effectExtent l="0" t="0" r="0" b="635"/>
-            <wp:docPr id="15" name="Image 15"/>
-            <wp:cNvGraphicFramePr>
-              <a:graphicFrameLocks xmlns:a="http://schemas.openxmlformats.org/drawingml/2006/main" noChangeAspect="1"/>
-            </wp:cNvGraphicFramePr>
-            <a:graphic xmlns:a="http://schemas.openxmlformats.org/drawingml/2006/main">
-              <a:graphicData uri="http://schemas.openxmlformats.org/drawingml/2006/picture">
-                <pic:pic xmlns:pic="http://schemas.openxmlformats.org/drawingml/2006/picture">
-                  <pic:nvPicPr>
-                    <pic:cNvPr id="15" name="Image 15"/>
-                    <pic:cNvPicPr/>
-                  </pic:nvPicPr>
-                  <pic:blipFill>
-                    <a:blip r:embed="rId27">
-                      <a:extLst>
-                        <a:ext uri="{28A0092B-C50C-407E-A947-70E740481C1C}">
-                          <a14:useLocalDpi xmlns:a14="http://schemas.microsoft.com/office/drawing/2010/main" val="0"/>
-                        </a:ext>
-                      </a:extLst>
-                    </a:blip>
-                    <a:stretch>
-                      <a:fillRect/>
-                    </a:stretch>
-                  </pic:blipFill>
-                  <pic:spPr>
-                    <a:xfrm>
-                      <a:off x="0" y="0"/>
-                      <a:ext cx="6253480" cy="1409065"/>
-                    </a:xfrm>
-                    <a:prstGeom prst="rect">
-                      <a:avLst/>
-                    </a:prstGeom>
-                  </pic:spPr>
-                </pic:pic>
-              </a:graphicData>
-            </a:graphic>
-          </wp:inline>
-        </w:drawing>
-      </w:r>
-    </w:p>
-    <w:p/>
-    <w:p>
-      <w:bookmarkStart w:id="23" w:name="_Hlk183424357"/>
-      <w:r>
-        <w:t>Le package s’installe, vous n’avez plus qu’à relancer QGIS.</w:t>
-      </w:r>
-    </w:p>
-    <w:bookmarkEnd w:id="23"/>
-    <w:p/>
-    <w:p/>
+      <w:r>
+        <w:t>permet de suivre l’</w:t>
+      </w:r>
+      <w:r>
+        <w:t>historique</w:t>
+      </w:r>
+      <w:r>
+        <w:t xml:space="preserve"> des différentes versions ainsi que d’afficher cette documentation.</w:t>
+      </w:r>
+    </w:p>
     <w:sectPr>
-      <w:footerReference w:type="default" r:id="rId28"/>
-      <w:footerReference w:type="first" r:id="rId29"/>
+      <w:footerReference w:type="default" r:id="rId35"/>
+      <w:footerReference w:type="first" r:id="rId36"/>
       <w:pgSz w:w="11906" w:h="16838" w:code="9"/>
       <w:pgMar w:top="851" w:right="924" w:bottom="1616" w:left="1134" w:header="709" w:footer="607" w:gutter="0"/>
       <w:cols w:space="708"/>
@@ -4261,7 +5047,7 @@
             <w:tag w:val="_DCDateCreated"/>
             <w:id w:val="317545533"/>
             <w:dataBinding w:prefixMappings="xmlns:ns0='http://schemas.microsoft.com/office/2006/metadata/properties' xmlns:ns1='http://www.w3.org/2001/XMLSchema-instance' xmlns:ns2='http://schemas.microsoft.com/office/infopath/2007/PartnerControls' xmlns:ns3='a1322699-2fbb-4cce-8aba-176c4fa97253' xmlns:ns4='http://schemas.microsoft.com/sharepoint/v3' xmlns:ns5='http://schemas.microsoft.com/sharepoint/v3/fields' xmlns:ns6='f0ff482e-aa3b-417e-9d65-5f4cb2656651' " w:xpath="/ns0:properties[1]/documentManagement[1]/ns5:_DCDateCreated[1]" w:storeItemID="{1159403A-C237-488E-8C5E-DABF9FCE7043}"/>
-            <w:date w:fullDate="2025-08-29T00:00:00Z">
+            <w:date w:fullDate="2025-11-18T00:00:00Z">
               <w:dateFormat w:val="dd/MM/yyyy"/>
               <w:lid w:val="fr-FR"/>
               <w:storeMappedDataAs w:val="dateTime"/>
@@ -4295,57 +5081,7 @@
                   <w:sz w:val="16"/>
                   <w:szCs w:val="16"/>
                 </w:rPr>
-                <w:t>2</w:t>
-              </w:r>
-              <w:r>
-                <w:rPr>
-                  <w:rFonts w:eastAsia="Calibri"/>
-                  <w:noProof/>
-                  <w:color w:val="002060"/>
-                  <w:sz w:val="16"/>
-                  <w:szCs w:val="16"/>
-                </w:rPr>
-                <w:t>9</w:t>
-              </w:r>
-              <w:r>
-                <w:rPr>
-                  <w:rFonts w:eastAsia="Calibri"/>
-                  <w:noProof/>
-                  <w:color w:val="002060"/>
-                  <w:sz w:val="16"/>
-                  <w:szCs w:val="16"/>
-                </w:rPr>
-                <w:t>/0</w:t>
-              </w:r>
-              <w:r>
-                <w:rPr>
-                  <w:rFonts w:eastAsia="Calibri"/>
-                  <w:noProof/>
-                  <w:color w:val="002060"/>
-                  <w:sz w:val="16"/>
-                  <w:szCs w:val="16"/>
-                </w:rPr>
-                <w:t>8</w:t>
-              </w:r>
-              <w:r>
-                <w:rPr>
-                  <w:rFonts w:eastAsia="Calibri"/>
-                  <w:noProof/>
-                  <w:color w:val="002060"/>
-                  <w:sz w:val="16"/>
-                  <w:szCs w:val="16"/>
-                </w:rPr>
-                <w:t>/202</w:t>
-              </w:r>
-              <w:r>
-                <w:rPr>
-                  <w:rFonts w:eastAsia="Calibri"/>
-                  <w:noProof/>
-                  <w:color w:val="002060"/>
-                  <w:sz w:val="16"/>
-                  <w:szCs w:val="16"/>
-                </w:rPr>
-                <w:t>5</w:t>
+                <w:t>18/11/2025</w:t>
               </w:r>
             </w:p>
           </w:sdtContent>
@@ -5279,6 +6015,118 @@
       </w:rPr>
     </w:lvl>
   </w:abstractNum>
+  <w:abstractNum w:abstractNumId="5" w15:restartNumberingAfterBreak="0">
+    <w:nsid w:val="7D656483"/>
+    <w:multiLevelType w:val="hybridMultilevel"/>
+    <w:tmpl w:val="F8E2AEEC"/>
+    <w:lvl w:ilvl="0" w:tplc="08E6C32C">
+      <w:numFmt w:val="bullet"/>
+      <w:lvlText w:val="-"/>
+      <w:lvlJc w:val="left"/>
+      <w:pPr>
+        <w:ind w:left="720" w:hanging="360"/>
+      </w:pPr>
+      <w:rPr>
+        <w:rFonts w:ascii="Arial" w:eastAsiaTheme="minorHAnsi" w:hAnsi="Arial" w:cs="Arial" w:hint="default"/>
+      </w:rPr>
+    </w:lvl>
+    <w:lvl w:ilvl="1" w:tplc="040C0003" w:tentative="1">
+      <w:start w:val="1"/>
+      <w:numFmt w:val="bullet"/>
+      <w:lvlText w:val="o"/>
+      <w:lvlJc w:val="left"/>
+      <w:pPr>
+        <w:ind w:left="1440" w:hanging="360"/>
+      </w:pPr>
+      <w:rPr>
+        <w:rFonts w:ascii="Courier New" w:hAnsi="Courier New" w:cs="Courier New" w:hint="default"/>
+      </w:rPr>
+    </w:lvl>
+    <w:lvl w:ilvl="2" w:tplc="040C0005" w:tentative="1">
+      <w:start w:val="1"/>
+      <w:numFmt w:val="bullet"/>
+      <w:lvlText w:val=""/>
+      <w:lvlJc w:val="left"/>
+      <w:pPr>
+        <w:ind w:left="2160" w:hanging="360"/>
+      </w:pPr>
+      <w:rPr>
+        <w:rFonts w:ascii="Wingdings" w:hAnsi="Wingdings" w:hint="default"/>
+      </w:rPr>
+    </w:lvl>
+    <w:lvl w:ilvl="3" w:tplc="040C0001" w:tentative="1">
+      <w:start w:val="1"/>
+      <w:numFmt w:val="bullet"/>
+      <w:lvlText w:val=""/>
+      <w:lvlJc w:val="left"/>
+      <w:pPr>
+        <w:ind w:left="2880" w:hanging="360"/>
+      </w:pPr>
+      <w:rPr>
+        <w:rFonts w:ascii="Symbol" w:hAnsi="Symbol" w:hint="default"/>
+      </w:rPr>
+    </w:lvl>
+    <w:lvl w:ilvl="4" w:tplc="040C0003" w:tentative="1">
+      <w:start w:val="1"/>
+      <w:numFmt w:val="bullet"/>
+      <w:lvlText w:val="o"/>
+      <w:lvlJc w:val="left"/>
+      <w:pPr>
+        <w:ind w:left="3600" w:hanging="360"/>
+      </w:pPr>
+      <w:rPr>
+        <w:rFonts w:ascii="Courier New" w:hAnsi="Courier New" w:cs="Courier New" w:hint="default"/>
+      </w:rPr>
+    </w:lvl>
+    <w:lvl w:ilvl="5" w:tplc="040C0005" w:tentative="1">
+      <w:start w:val="1"/>
+      <w:numFmt w:val="bullet"/>
+      <w:lvlText w:val=""/>
+      <w:lvlJc w:val="left"/>
+      <w:pPr>
+        <w:ind w:left="4320" w:hanging="360"/>
+      </w:pPr>
+      <w:rPr>
+        <w:rFonts w:ascii="Wingdings" w:hAnsi="Wingdings" w:hint="default"/>
+      </w:rPr>
+    </w:lvl>
+    <w:lvl w:ilvl="6" w:tplc="040C0001" w:tentative="1">
+      <w:start w:val="1"/>
+      <w:numFmt w:val="bullet"/>
+      <w:lvlText w:val=""/>
+      <w:lvlJc w:val="left"/>
+      <w:pPr>
+        <w:ind w:left="5040" w:hanging="360"/>
+      </w:pPr>
+      <w:rPr>
+        <w:rFonts w:ascii="Symbol" w:hAnsi="Symbol" w:hint="default"/>
+      </w:rPr>
+    </w:lvl>
+    <w:lvl w:ilvl="7" w:tplc="040C0003" w:tentative="1">
+      <w:start w:val="1"/>
+      <w:numFmt w:val="bullet"/>
+      <w:lvlText w:val="o"/>
+      <w:lvlJc w:val="left"/>
+      <w:pPr>
+        <w:ind w:left="5760" w:hanging="360"/>
+      </w:pPr>
+      <w:rPr>
+        <w:rFonts w:ascii="Courier New" w:hAnsi="Courier New" w:cs="Courier New" w:hint="default"/>
+      </w:rPr>
+    </w:lvl>
+    <w:lvl w:ilvl="8" w:tplc="040C0005" w:tentative="1">
+      <w:start w:val="1"/>
+      <w:numFmt w:val="bullet"/>
+      <w:lvlText w:val=""/>
+      <w:lvlJc w:val="left"/>
+      <w:pPr>
+        <w:ind w:left="6480" w:hanging="360"/>
+      </w:pPr>
+      <w:rPr>
+        <w:rFonts w:ascii="Wingdings" w:hAnsi="Wingdings" w:hint="default"/>
+      </w:rPr>
+    </w:lvl>
+  </w:abstractNum>
   <w:num w:numId="1">
     <w:abstractNumId w:val="4"/>
   </w:num>
@@ -5293,6 +6141,9 @@
   </w:num>
   <w:num w:numId="5">
     <w:abstractNumId w:val="0"/>
+  </w:num>
+  <w:num w:numId="6">
+    <w:abstractNumId w:val="5"/>
   </w:num>
   <w:numIdMacAtCleanup w:val="5"/>
 </w:numbering>
@@ -7117,6 +7968,9 @@
     <w:rsid w:val="000D4DEE"/>
     <w:rsid w:val="00162DC9"/>
     <w:rsid w:val="003259A4"/>
+    <w:rsid w:val="00382C53"/>
+    <w:rsid w:val="003D52E7"/>
+    <w:rsid w:val="004561EF"/>
     <w:rsid w:val="00471113"/>
     <w:rsid w:val="0054019A"/>
     <w:rsid w:val="00596E3A"/>
@@ -7130,6 +7984,7 @@
     <w:rsid w:val="007A7BE2"/>
     <w:rsid w:val="00867085"/>
     <w:rsid w:val="008A76C2"/>
+    <w:rsid w:val="008B038C"/>
     <w:rsid w:val="008E3192"/>
     <w:rsid w:val="00954009"/>
     <w:rsid w:val="009A19EF"/>

</xml_diff>